<commit_message>
docs: update GitHub repository link to https://github.com/raunakkwatra/CricketBuddy and update document metadata
</commit_message>
<xml_diff>
--- a/CricketBuddy_Project_Report.docx
+++ b/CricketBuddy_Project_Report.docx
@@ -3763,23 +3763,36 @@
     </w:p>
     <w:p>
       <w:pPr>
-        <w:spacing w:before="0" w:after="140" w:line="276" w:lineRule="auto"/>
-        <w:rPr>
-          <w:rFonts w:ascii="Times New Roman" w:hAnsi="Times New Roman" w:cs="Times New Roman"/>
-          <w:b/>
-          <w:bCs/>
-          <w:color w:val="1E40AF"/>
-        </w:rPr>
-      </w:pPr>
-      <w:r>
-        <w:rPr>
-          <w:rFonts w:ascii="Times New Roman" w:hAnsi="Times New Roman" w:cs="Times New Roman"/>
-          <w:b/>
-          <w:bCs/>
-          <w:color w:val="1E40AF"/>
-        </w:rPr>
-        <w:t xml:space="preserve">GitHub Repository: https://github.com/raunakkwatra/CricketBuddy</w:t>
-      </w:r>
+        <w:spacing w:before="40" w:after="160" w:line="276" w:lineRule="auto"/>
+        <w:rPr>
+          <w:rFonts w:ascii="Times New Roman" w:hAnsi="Times New Roman" w:cs="Times New Roman"/>
+        </w:rPr>
+      </w:pPr>
+      <w:r>
+        <w:rPr>
+          <w:rFonts w:ascii="Times New Roman" w:hAnsi="Times New Roman" w:cs="Times New Roman"/>
+          <w:b/>
+          <w:bCs/>
+          <w:sz w:val="23"/>
+          <w:szCs w:val="23"/>
+          <w:color w:val="0F172A"/>
+        </w:rPr>
+        <w:t>GitHub Repository: </w:t>
+      </w:r>
+      <w:hyperlink r:id="rId30" w:history="1">
+        <w:r>
+          <w:rPr>
+            <w:rFonts w:ascii="Times New Roman" w:hAnsi="Times New Roman" w:cs="Times New Roman"/>
+            <w:b/>
+            <w:bCs/>
+            <w:u w:val="single"/>
+            <w:sz w:val="23"/>
+            <w:szCs w:val="23"/>
+            <w:color w:val="1E40AF"/>
+          </w:rPr>
+          <w:t>https://github.com/raunakkwatra/CricketBuddy</w:t>
+        </w:r>
+      </w:hyperlink>
     </w:p>
     <w:p>
       <w:pPr>
@@ -4448,7 +4461,7 @@
           <wp:inline distT="0" distB="0" distL="0" distR="0">
             <wp:extent cx="5486400" cy="3550000"/>
             <wp:effectExtent l="0" t="0" r="0" b="0"/>
-            <wp:docPr id="27027070" name="ER Diagram"/>
+            <wp:docPr id="8328288" name="ER Diagram"/>
             <wp:cNvGraphicFramePr>
               <a:graphicFrameLocks xmlns:a="http://schemas.openxmlformats.org/drawingml/2006/main" noChangeAspect="1"/>
             </wp:cNvGraphicFramePr>
@@ -12244,7 +12257,7 @@
           <wp:inline distT="0" distB="0" distL="0" distR="0">
             <wp:extent cx="5486400" cy="3321620"/>
             <wp:effectExtent l="0" t="0" r="0" b="0"/>
-            <wp:docPr id="22444384" name="MySQL Tables"/>
+            <wp:docPr id="27755497" name="MySQL Tables"/>
             <wp:cNvGraphicFramePr>
               <a:graphicFrameLocks xmlns:a="http://schemas.openxmlformats.org/drawingml/2006/main" noChangeAspect="1"/>
             </wp:cNvGraphicFramePr>
@@ -12312,7 +12325,7 @@
           <wp:inline distT="0" distB="0" distL="0" distR="0">
             <wp:extent cx="5486400" cy="3868340"/>
             <wp:effectExtent l="0" t="0" r="0" b="0"/>
-            <wp:docPr id="90117738" name="MySQL Describe"/>
+            <wp:docPr id="53543772" name="MySQL Describe"/>
             <wp:cNvGraphicFramePr>
               <a:graphicFrameLocks xmlns:a="http://schemas.openxmlformats.org/drawingml/2006/main" noChangeAspect="1"/>
             </wp:cNvGraphicFramePr>
@@ -12421,7 +12434,7 @@
           <wp:inline distT="0" distB="0" distL="0" distR="0">
             <wp:extent cx="5486400" cy="3118246"/>
             <wp:effectExtent l="0" t="0" r="0" b="0"/>
-            <wp:docPr id="51345994" name="Dashboard"/>
+            <wp:docPr id="89168778" name="Dashboard"/>
             <wp:cNvGraphicFramePr>
               <a:graphicFrameLocks xmlns:a="http://schemas.openxmlformats.org/drawingml/2006/main" noChangeAspect="1"/>
             </wp:cNvGraphicFramePr>
@@ -12530,7 +12543,7 @@
           <wp:inline distT="0" distB="0" distL="0" distR="0">
             <wp:extent cx="5486400" cy="3080742"/>
             <wp:effectExtent l="0" t="0" r="0" b="0"/>
-            <wp:docPr id="24657367" name="Teams Roster"/>
+            <wp:docPr id="33588883" name="Teams Roster"/>
             <wp:cNvGraphicFramePr>
               <a:graphicFrameLocks xmlns:a="http://schemas.openxmlformats.org/drawingml/2006/main" noChangeAspect="1"/>
             </wp:cNvGraphicFramePr>
@@ -12639,7 +12652,7 @@
           <wp:inline distT="0" distB="0" distL="0" distR="0">
             <wp:extent cx="5486400" cy="3107531"/>
             <wp:effectExtent l="0" t="0" r="0" b="0"/>
-            <wp:docPr id="92902331" name="Players Roster"/>
+            <wp:docPr id="18001619" name="Players Roster"/>
             <wp:cNvGraphicFramePr>
               <a:graphicFrameLocks xmlns:a="http://schemas.openxmlformats.org/drawingml/2006/main" noChangeAspect="1"/>
             </wp:cNvGraphicFramePr>
@@ -12748,7 +12761,7 @@
           <wp:inline distT="0" distB="0" distL="0" distR="0">
             <wp:extent cx="5486400" cy="3064668"/>
             <wp:effectExtent l="0" t="0" r="0" b="0"/>
-            <wp:docPr id="45558477" name="Tournament Matches"/>
+            <wp:docPr id="72064778" name="Tournament Matches"/>
             <wp:cNvGraphicFramePr>
               <a:graphicFrameLocks xmlns:a="http://schemas.openxmlformats.org/drawingml/2006/main" noChangeAspect="1"/>
             </wp:cNvGraphicFramePr>
@@ -12857,7 +12870,7 @@
           <wp:inline distT="0" distB="0" distL="0" distR="0">
             <wp:extent cx="5486400" cy="3118246"/>
             <wp:effectExtent l="0" t="0" r="0" b="0"/>
-            <wp:docPr id="33431342" name="Match Scorecards"/>
+            <wp:docPr id="43732518" name="Match Scorecards"/>
             <wp:cNvGraphicFramePr>
               <a:graphicFrameLocks xmlns:a="http://schemas.openxmlformats.org/drawingml/2006/main" noChangeAspect="1"/>
             </wp:cNvGraphicFramePr>
@@ -12966,7 +12979,7 @@
           <wp:inline distT="0" distB="0" distL="0" distR="0">
             <wp:extent cx="5486400" cy="3091457"/>
             <wp:effectExtent l="0" t="0" r="0" b="0"/>
-            <wp:docPr id="96164721" name="Stadiums View"/>
+            <wp:docPr id="72305068" name="Stadiums View"/>
             <wp:cNvGraphicFramePr>
               <a:graphicFrameLocks xmlns:a="http://schemas.openxmlformats.org/drawingml/2006/main" noChangeAspect="1"/>
             </wp:cNvGraphicFramePr>
@@ -13075,7 +13088,7 @@
           <wp:inline distT="0" distB="0" distL="0" distR="0">
             <wp:extent cx="5486400" cy="3086100"/>
             <wp:effectExtent l="0" t="0" r="0" b="0"/>
-            <wp:docPr id="46658197" name="Tournament Analytics"/>
+            <wp:docPr id="60116886" name="Tournament Analytics"/>
             <wp:cNvGraphicFramePr>
               <a:graphicFrameLocks xmlns:a="http://schemas.openxmlformats.org/drawingml/2006/main" noChangeAspect="1"/>
             </wp:cNvGraphicFramePr>
@@ -13184,7 +13197,7 @@
           <wp:inline distT="0" distB="0" distL="0" distR="0">
             <wp:extent cx="5486400" cy="3123604"/>
             <wp:effectExtent l="0" t="0" r="0" b="0"/>
-            <wp:docPr id="50591607" name="Sponsorships"/>
+            <wp:docPr id="54069404" name="Sponsorships"/>
             <wp:cNvGraphicFramePr>
               <a:graphicFrameLocks xmlns:a="http://schemas.openxmlformats.org/drawingml/2006/main" noChangeAspect="1"/>
             </wp:cNvGraphicFramePr>
@@ -13293,7 +13306,7 @@
           <wp:inline distT="0" distB="0" distL="0" distR="0">
             <wp:extent cx="5486400" cy="3059310"/>
             <wp:effectExtent l="0" t="0" r="0" b="0"/>
-            <wp:docPr id="42922870" name="Umpires"/>
+            <wp:docPr id="49000217" name="Umpires"/>
             <wp:cNvGraphicFramePr>
               <a:graphicFrameLocks xmlns:a="http://schemas.openxmlformats.org/drawingml/2006/main" noChangeAspect="1"/>
             </wp:cNvGraphicFramePr>
@@ -13402,7 +13415,7 @@
           <wp:inline distT="0" distB="0" distL="0" distR="0">
             <wp:extent cx="5486400" cy="3086100"/>
             <wp:effectExtent l="0" t="0" r="0" b="0"/>
-            <wp:docPr id="61739826" name="Authentication Modal"/>
+            <wp:docPr id="25899132" name="Authentication Modal"/>
             <wp:cNvGraphicFramePr>
               <a:graphicFrameLocks xmlns:a="http://schemas.openxmlformats.org/drawingml/2006/main" noChangeAspect="1"/>
             </wp:cNvGraphicFramePr>
@@ -13511,7 +13524,7 @@
           <wp:inline distT="0" distB="0" distL="0" distR="0">
             <wp:extent cx="5486400" cy="3091457"/>
             <wp:effectExtent l="0" t="0" r="0" b="0"/>
-            <wp:docPr id="6003417" name="Global Search Dropdown"/>
+            <wp:docPr id="50491191" name="Global Search Dropdown"/>
             <wp:cNvGraphicFramePr>
               <a:graphicFrameLocks xmlns:a="http://schemas.openxmlformats.org/drawingml/2006/main" noChangeAspect="1"/>
             </wp:cNvGraphicFramePr>

</xml_diff>

<commit_message>
docs: remove SheetForge references from project report docx
</commit_message>
<xml_diff>
--- a/CricketBuddy_Project_Report.docx
+++ b/CricketBuddy_Project_Report.docx
@@ -1072,7 +1072,7 @@
           <w:rFonts w:ascii="Times New Roman" w:hAnsi="Times New Roman" w:cs="Times New Roman"/>
           <w:color w:val="1E293B"/>
         </w:rPr>
-        <w:t xml:space="preserve">The service layer is powered by Node.js and Express.js, providing an asynchronous RESTful API architecture connecting client interactions to the MySQL database engine through an optimized connection pool. The presentation layer is built with modern HTML5, CSS3, dynamic JavaScript, and Lucide icons, offering a responsive user interface with live global search, dynamic statistical filtering, theme toggle (dark/light), and a SheetForge-inspired dual-mode role-based access control (RBAC). In this architecture, administrators authenticate via a secure master password to unlock complete CRUD capabilities, while viewers enter their identity details to browse rosters, fixtures, valuations, and match scorecards in a safe read-only environment.</w:t>
+        <w:t xml:space="preserve">The service layer is powered by Node.js and Express.js, providing an asynchronous RESTful API architecture connecting client interactions to the MySQL database engine through an optimized connection pool. The presentation layer is built with modern HTML5, CSS3, dynamic JavaScript, and Lucide icons, offering a responsive user interface with live global search, dynamic statistical filtering, theme toggle (dark/light), and an intuitive dual-mode role-based access control (RBAC). In this architecture, administrators authenticate via a secure master password to unlock complete CRUD capabilities, while viewers enter their identity details to browse rosters, fixtures, valuations, and match scorecards in a safe read-only environment.</w:t>
       </w:r>
     </w:p>
     <w:p>
@@ -3241,7 +3241,7 @@
           <w:szCs w:val="22"/>
           <w:color w:val="334155"/>
         </w:rPr>
-        <w:t>Figure 4.12: SheetForge-Style Dual-Mode Authentication Modal (Admin vs Viewer)</w:t>
+        <w:t>Figure 4.12: Dual-Mode Role-Based Authentication Modal (Admin vs Viewer)</w:t>
       </w:r>
       <w:r>
         <w:rPr>
@@ -4461,7 +4461,7 @@
           <wp:inline distT="0" distB="0" distL="0" distR="0">
             <wp:extent cx="5486400" cy="3550000"/>
             <wp:effectExtent l="0" t="0" r="0" b="0"/>
-            <wp:docPr id="8328288" name="ER Diagram"/>
+            <wp:docPr id="68710272" name="ER Diagram"/>
             <wp:cNvGraphicFramePr>
               <a:graphicFrameLocks xmlns:a="http://schemas.openxmlformats.org/drawingml/2006/main" noChangeAspect="1"/>
             </wp:cNvGraphicFramePr>
@@ -12257,7 +12257,7 @@
           <wp:inline distT="0" distB="0" distL="0" distR="0">
             <wp:extent cx="5486400" cy="3321620"/>
             <wp:effectExtent l="0" t="0" r="0" b="0"/>
-            <wp:docPr id="27755497" name="MySQL Tables"/>
+            <wp:docPr id="41130903" name="MySQL Tables"/>
             <wp:cNvGraphicFramePr>
               <a:graphicFrameLocks xmlns:a="http://schemas.openxmlformats.org/drawingml/2006/main" noChangeAspect="1"/>
             </wp:cNvGraphicFramePr>
@@ -12325,7 +12325,7 @@
           <wp:inline distT="0" distB="0" distL="0" distR="0">
             <wp:extent cx="5486400" cy="3868340"/>
             <wp:effectExtent l="0" t="0" r="0" b="0"/>
-            <wp:docPr id="53543772" name="MySQL Describe"/>
+            <wp:docPr id="78810342" name="MySQL Describe"/>
             <wp:cNvGraphicFramePr>
               <a:graphicFrameLocks xmlns:a="http://schemas.openxmlformats.org/drawingml/2006/main" noChangeAspect="1"/>
             </wp:cNvGraphicFramePr>
@@ -12434,7 +12434,7 @@
           <wp:inline distT="0" distB="0" distL="0" distR="0">
             <wp:extent cx="5486400" cy="3118246"/>
             <wp:effectExtent l="0" t="0" r="0" b="0"/>
-            <wp:docPr id="89168778" name="Dashboard"/>
+            <wp:docPr id="6479426" name="Dashboard"/>
             <wp:cNvGraphicFramePr>
               <a:graphicFrameLocks xmlns:a="http://schemas.openxmlformats.org/drawingml/2006/main" noChangeAspect="1"/>
             </wp:cNvGraphicFramePr>
@@ -12543,7 +12543,7 @@
           <wp:inline distT="0" distB="0" distL="0" distR="0">
             <wp:extent cx="5486400" cy="3080742"/>
             <wp:effectExtent l="0" t="0" r="0" b="0"/>
-            <wp:docPr id="33588883" name="Teams Roster"/>
+            <wp:docPr id="88671582" name="Teams Roster"/>
             <wp:cNvGraphicFramePr>
               <a:graphicFrameLocks xmlns:a="http://schemas.openxmlformats.org/drawingml/2006/main" noChangeAspect="1"/>
             </wp:cNvGraphicFramePr>
@@ -12652,7 +12652,7 @@
           <wp:inline distT="0" distB="0" distL="0" distR="0">
             <wp:extent cx="5486400" cy="3107531"/>
             <wp:effectExtent l="0" t="0" r="0" b="0"/>
-            <wp:docPr id="18001619" name="Players Roster"/>
+            <wp:docPr id="21552273" name="Players Roster"/>
             <wp:cNvGraphicFramePr>
               <a:graphicFrameLocks xmlns:a="http://schemas.openxmlformats.org/drawingml/2006/main" noChangeAspect="1"/>
             </wp:cNvGraphicFramePr>
@@ -12761,7 +12761,7 @@
           <wp:inline distT="0" distB="0" distL="0" distR="0">
             <wp:extent cx="5486400" cy="3064668"/>
             <wp:effectExtent l="0" t="0" r="0" b="0"/>
-            <wp:docPr id="72064778" name="Tournament Matches"/>
+            <wp:docPr id="9676076" name="Tournament Matches"/>
             <wp:cNvGraphicFramePr>
               <a:graphicFrameLocks xmlns:a="http://schemas.openxmlformats.org/drawingml/2006/main" noChangeAspect="1"/>
             </wp:cNvGraphicFramePr>
@@ -12870,7 +12870,7 @@
           <wp:inline distT="0" distB="0" distL="0" distR="0">
             <wp:extent cx="5486400" cy="3118246"/>
             <wp:effectExtent l="0" t="0" r="0" b="0"/>
-            <wp:docPr id="43732518" name="Match Scorecards"/>
+            <wp:docPr id="32119401" name="Match Scorecards"/>
             <wp:cNvGraphicFramePr>
               <a:graphicFrameLocks xmlns:a="http://schemas.openxmlformats.org/drawingml/2006/main" noChangeAspect="1"/>
             </wp:cNvGraphicFramePr>
@@ -12979,7 +12979,7 @@
           <wp:inline distT="0" distB="0" distL="0" distR="0">
             <wp:extent cx="5486400" cy="3091457"/>
             <wp:effectExtent l="0" t="0" r="0" b="0"/>
-            <wp:docPr id="72305068" name="Stadiums View"/>
+            <wp:docPr id="99781944" name="Stadiums View"/>
             <wp:cNvGraphicFramePr>
               <a:graphicFrameLocks xmlns:a="http://schemas.openxmlformats.org/drawingml/2006/main" noChangeAspect="1"/>
             </wp:cNvGraphicFramePr>
@@ -13088,7 +13088,7 @@
           <wp:inline distT="0" distB="0" distL="0" distR="0">
             <wp:extent cx="5486400" cy="3086100"/>
             <wp:effectExtent l="0" t="0" r="0" b="0"/>
-            <wp:docPr id="60116886" name="Tournament Analytics"/>
+            <wp:docPr id="33130059" name="Tournament Analytics"/>
             <wp:cNvGraphicFramePr>
               <a:graphicFrameLocks xmlns:a="http://schemas.openxmlformats.org/drawingml/2006/main" noChangeAspect="1"/>
             </wp:cNvGraphicFramePr>
@@ -13197,7 +13197,7 @@
           <wp:inline distT="0" distB="0" distL="0" distR="0">
             <wp:extent cx="5486400" cy="3123604"/>
             <wp:effectExtent l="0" t="0" r="0" b="0"/>
-            <wp:docPr id="54069404" name="Sponsorships"/>
+            <wp:docPr id="36203514" name="Sponsorships"/>
             <wp:cNvGraphicFramePr>
               <a:graphicFrameLocks xmlns:a="http://schemas.openxmlformats.org/drawingml/2006/main" noChangeAspect="1"/>
             </wp:cNvGraphicFramePr>
@@ -13306,7 +13306,7 @@
           <wp:inline distT="0" distB="0" distL="0" distR="0">
             <wp:extent cx="5486400" cy="3059310"/>
             <wp:effectExtent l="0" t="0" r="0" b="0"/>
-            <wp:docPr id="49000217" name="Umpires"/>
+            <wp:docPr id="81334988" name="Umpires"/>
             <wp:cNvGraphicFramePr>
               <a:graphicFrameLocks xmlns:a="http://schemas.openxmlformats.org/drawingml/2006/main" noChangeAspect="1"/>
             </wp:cNvGraphicFramePr>
@@ -13402,7 +13402,7 @@
           <w:rFonts w:ascii="Times New Roman" w:hAnsi="Times New Roman" w:cs="Times New Roman"/>
           <w:color w:val="1E293B"/>
         </w:rPr>
-        <w:t xml:space="preserve">Modeled after SheetForge, CricketBuddy implements a dual-mode authentication modal. The Admin Login tab requires entering the master password ('admin123') to unlock full create, edit, and delete permissions. The Viewer Access tab requires no password; the user enters their full name and optional affiliation to immediately explore all tournament tables in a secure read-only mode.</w:t>
+        <w:t xml:space="preserve">CricketBuddy implements a dual-mode role-based authentication modal. The Admin Login tab requires entering the master password ('admin123') to unlock full create, edit, and delete permissions. The Viewer Access tab requires no password; the user enters their full name and optional affiliation to immediately explore all tournament tables in a secure read-only mode.</w:t>
       </w:r>
     </w:p>
     <w:p>
@@ -13415,7 +13415,7 @@
           <wp:inline distT="0" distB="0" distL="0" distR="0">
             <wp:extent cx="5486400" cy="3086100"/>
             <wp:effectExtent l="0" t="0" r="0" b="0"/>
-            <wp:docPr id="25899132" name="Authentication Modal"/>
+            <wp:docPr id="40670832" name="Authentication Modal"/>
             <wp:cNvGraphicFramePr>
               <a:graphicFrameLocks xmlns:a="http://schemas.openxmlformats.org/drawingml/2006/main" noChangeAspect="1"/>
             </wp:cNvGraphicFramePr>
@@ -13470,7 +13470,7 @@
           <w:szCs w:val="21"/>
           <w:color w:val="1E293B"/>
         </w:rPr>
-        <w:t>Figure 4.12: SheetForge-Style Dual-Mode Authentication Modal (Admin vs Viewer)</w:t>
+        <w:t>Figure 4.12: Dual-Mode Role-Based Authentication Modal (Admin vs Viewer)</w:t>
       </w:r>
     </w:p>
     <w:p>
@@ -13524,7 +13524,7 @@
           <wp:inline distT="0" distB="0" distL="0" distR="0">
             <wp:extent cx="5486400" cy="3091457"/>
             <wp:effectExtent l="0" t="0" r="0" b="0"/>
-            <wp:docPr id="50491191" name="Global Search Dropdown"/>
+            <wp:docPr id="34229493" name="Global Search Dropdown"/>
             <wp:cNvGraphicFramePr>
               <a:graphicFrameLocks xmlns:a="http://schemas.openxmlformats.org/drawingml/2006/main" noChangeAspect="1"/>
             </wp:cNvGraphicFramePr>

</xml_diff>

<commit_message>
feat: integrate 7 MySQL database views into schema, backend API, project report, and documentation
</commit_message>
<xml_diff>
--- a/CricketBuddy_Project_Report.docx
+++ b/CricketBuddy_Project_Report.docx
@@ -1889,45 +1889,6 @@
     </w:p>
     <w:p>
       <w:pPr>
-        <w:tabs>
-          <w:tab w:val="right" w:leader="dot" w:pos="9360"/>
-        </w:tabs>
-        <w:spacing w:before="30" w:after="30" w:line="240" w:lineRule="auto"/>
-        <w:rPr>
-          <w:rFonts w:ascii="Times New Roman" w:hAnsi="Times New Roman" w:cs="Times New Roman"/>
-          <w:b/>
-          <w:bCs/>
-          <w:sz w:val="23"/>
-          <w:szCs w:val="23"/>
-          <w:color w:val="0F172A"/>
-        </w:rPr>
-      </w:pPr>
-      <w:r>
-        <w:rPr>
-          <w:rFonts w:ascii="Times New Roman" w:hAnsi="Times New Roman" w:cs="Times New Roman"/>
-          <w:b/>
-          <w:bCs/>
-          <w:sz w:val="23"/>
-          <w:szCs w:val="23"/>
-          <w:color w:val="0F172A"/>
-        </w:rPr>
-        <w:t>Chapter 4: Implementation and Screenshots</w:t>
-      </w:r>
-      <w:r>
-        <w:rPr>
-          <w:rFonts w:ascii="Times New Roman" w:hAnsi="Times New Roman" w:cs="Times New Roman"/>
-          <w:b/>
-          <w:bCs/>
-          <w:sz w:val="23"/>
-          <w:szCs w:val="23"/>
-          <w:color w:val="0F172A"/>
-        </w:rPr>
-        <w:tab/>
-        <w:t>15</w:t>
-      </w:r>
-    </w:p>
-    <w:p>
-      <w:pPr>
         <w:ind w:left="360"/>
         <w:tabs>
           <w:tab w:val="right" w:leader="dot" w:pos="9360"/>
@@ -1947,14 +1908,53 @@
           <w:szCs w:val="22"/>
           <w:color w:val="334155"/>
         </w:rPr>
-        <w:t>4.1 Overview</w:t>
-      </w:r>
-      <w:r>
-        <w:rPr>
-          <w:rFonts w:ascii="Times New Roman" w:hAnsi="Times New Roman" w:cs="Times New Roman"/>
-          <w:sz w:val="22"/>
-          <w:szCs w:val="22"/>
-          <w:color w:val="334155"/>
+        <w:t>3.6 Database Views (Virtual Tables)</w:t>
+      </w:r>
+      <w:r>
+        <w:rPr>
+          <w:rFonts w:ascii="Times New Roman" w:hAnsi="Times New Roman" w:cs="Times New Roman"/>
+          <w:sz w:val="22"/>
+          <w:szCs w:val="22"/>
+          <w:color w:val="334155"/>
+        </w:rPr>
+        <w:tab/>
+        <w:t>14</w:t>
+      </w:r>
+    </w:p>
+    <w:p>
+      <w:pPr>
+        <w:tabs>
+          <w:tab w:val="right" w:leader="dot" w:pos="9360"/>
+        </w:tabs>
+        <w:spacing w:before="30" w:after="30" w:line="240" w:lineRule="auto"/>
+        <w:rPr>
+          <w:rFonts w:ascii="Times New Roman" w:hAnsi="Times New Roman" w:cs="Times New Roman"/>
+          <w:b/>
+          <w:bCs/>
+          <w:sz w:val="23"/>
+          <w:szCs w:val="23"/>
+          <w:color w:val="0F172A"/>
+        </w:rPr>
+      </w:pPr>
+      <w:r>
+        <w:rPr>
+          <w:rFonts w:ascii="Times New Roman" w:hAnsi="Times New Roman" w:cs="Times New Roman"/>
+          <w:b/>
+          <w:bCs/>
+          <w:sz w:val="23"/>
+          <w:szCs w:val="23"/>
+          <w:color w:val="0F172A"/>
+        </w:rPr>
+        <w:t>Chapter 4: Implementation and Screenshots</w:t>
+      </w:r>
+      <w:r>
+        <w:rPr>
+          <w:rFonts w:ascii="Times New Roman" w:hAnsi="Times New Roman" w:cs="Times New Roman"/>
+          <w:b/>
+          <w:bCs/>
+          <w:sz w:val="23"/>
+          <w:szCs w:val="23"/>
+          <w:color w:val="0F172A"/>
         </w:rPr>
         <w:tab/>
         <w:t>15</w:t>
@@ -1981,7 +1981,7 @@
           <w:szCs w:val="22"/>
           <w:color w:val="334155"/>
         </w:rPr>
-        <w:t>4.2 Database Implementation</w:t>
+        <w:t>4.1 Overview</w:t>
       </w:r>
       <w:r>
         <w:rPr>
@@ -2015,7 +2015,7 @@
           <w:szCs w:val="22"/>
           <w:color w:val="334155"/>
         </w:rPr>
-        <w:t>4.3 Tournament Overview Dashboard</w:t>
+        <w:t>4.2 Database Implementation</w:t>
       </w:r>
       <w:r>
         <w:rPr>
@@ -2025,7 +2025,7 @@
           <w:color w:val="334155"/>
         </w:rPr>
         <w:tab/>
-        <w:t>17</w:t>
+        <w:t>15</w:t>
       </w:r>
     </w:p>
     <w:p>
@@ -2049,7 +2049,7 @@
           <w:szCs w:val="22"/>
           <w:color w:val="334155"/>
         </w:rPr>
-        <w:t>4.4 Team Management and Franchises</w:t>
+        <w:t>4.3 Tournament Overview Dashboard</w:t>
       </w:r>
       <w:r>
         <w:rPr>
@@ -2059,7 +2059,7 @@
           <w:color w:val="334155"/>
         </w:rPr>
         <w:tab/>
-        <w:t>18</w:t>
+        <w:t>17</w:t>
       </w:r>
     </w:p>
     <w:p>
@@ -2083,7 +2083,7 @@
           <w:szCs w:val="22"/>
           <w:color w:val="334155"/>
         </w:rPr>
-        <w:t>4.5 Player Squad Roster and Athlete Profiles</w:t>
+        <w:t>4.4 Team Management and Franchises</w:t>
       </w:r>
       <w:r>
         <w:rPr>
@@ -2093,7 +2093,7 @@
           <w:color w:val="334155"/>
         </w:rPr>
         <w:tab/>
-        <w:t>19</w:t>
+        <w:t>18</w:t>
       </w:r>
     </w:p>
     <w:p>
@@ -2117,7 +2117,7 @@
           <w:szCs w:val="22"/>
           <w:color w:val="334155"/>
         </w:rPr>
-        <w:t>4.6 Tournament Matches and Fixture Scheduling</w:t>
+        <w:t>4.5 Player Squad Roster and Athlete Profiles</w:t>
       </w:r>
       <w:r>
         <w:rPr>
@@ -2127,7 +2127,7 @@
           <w:color w:val="334155"/>
         </w:rPr>
         <w:tab/>
-        <w:t>20</w:t>
+        <w:t>19</w:t>
       </w:r>
     </w:p>
     <w:p>
@@ -2151,7 +2151,7 @@
           <w:szCs w:val="22"/>
           <w:color w:val="334155"/>
         </w:rPr>
-        <w:t>4.7 Match Scorecards and Performance Logs</w:t>
+        <w:t>4.6 Tournament Matches and Fixture Scheduling</w:t>
       </w:r>
       <w:r>
         <w:rPr>
@@ -2161,7 +2161,7 @@
           <w:color w:val="334155"/>
         </w:rPr>
         <w:tab/>
-        <w:t>21</w:t>
+        <w:t>20</w:t>
       </w:r>
     </w:p>
     <w:p>
@@ -2185,7 +2185,7 @@
           <w:szCs w:val="22"/>
           <w:color w:val="334155"/>
         </w:rPr>
-        <w:t>4.8 Stadiums and Host Venues</w:t>
+        <w:t>4.7 Match Scorecards and Performance Logs</w:t>
       </w:r>
       <w:r>
         <w:rPr>
@@ -2195,7 +2195,7 @@
           <w:color w:val="334155"/>
         </w:rPr>
         <w:tab/>
-        <w:t>22</w:t>
+        <w:t>21</w:t>
       </w:r>
     </w:p>
     <w:p>
@@ -2219,7 +2219,7 @@
           <w:szCs w:val="22"/>
           <w:color w:val="334155"/>
         </w:rPr>
-        <w:t>4.9 Tournament Analytics and Aggregated Queries</w:t>
+        <w:t>4.8 Stadiums and Host Venues</w:t>
       </w:r>
       <w:r>
         <w:rPr>
@@ -2229,7 +2229,7 @@
           <w:color w:val="334155"/>
         </w:rPr>
         <w:tab/>
-        <w:t>23</w:t>
+        <w:t>22</w:t>
       </w:r>
     </w:p>
     <w:p>
@@ -2253,7 +2253,7 @@
           <w:szCs w:val="22"/>
           <w:color w:val="334155"/>
         </w:rPr>
-        <w:t>4.10 Commercial Team Sponsorships</w:t>
+        <w:t>4.9 Tournament Analytics and Aggregated Queries</w:t>
       </w:r>
       <w:r>
         <w:rPr>
@@ -2263,7 +2263,7 @@
           <w:color w:val="334155"/>
         </w:rPr>
         <w:tab/>
-        <w:t>24</w:t>
+        <w:t>23</w:t>
       </w:r>
     </w:p>
     <w:p>
@@ -2287,7 +2287,7 @@
           <w:szCs w:val="22"/>
           <w:color w:val="334155"/>
         </w:rPr>
-        <w:t>4.11 Certified Match Umpires and Referees</w:t>
+        <w:t>4.10 Commercial Team Sponsorships</w:t>
       </w:r>
       <w:r>
         <w:rPr>
@@ -2297,7 +2297,7 @@
           <w:color w:val="334155"/>
         </w:rPr>
         <w:tab/>
-        <w:t>25</w:t>
+        <w:t>24</w:t>
       </w:r>
     </w:p>
     <w:p>
@@ -2321,7 +2321,7 @@
           <w:szCs w:val="22"/>
           <w:color w:val="334155"/>
         </w:rPr>
-        <w:t>4.12 Dual-Mode Authentication and Role-Based Access Control</w:t>
+        <w:t>4.11 Certified Match Umpires and Referees</w:t>
       </w:r>
       <w:r>
         <w:rPr>
@@ -2331,7 +2331,7 @@
           <w:color w:val="334155"/>
         </w:rPr>
         <w:tab/>
-        <w:t>26</w:t>
+        <w:t>25</w:t>
       </w:r>
     </w:p>
     <w:p>
@@ -2355,7 +2355,7 @@
           <w:szCs w:val="22"/>
           <w:color w:val="334155"/>
         </w:rPr>
-        <w:t>4.13 Live Global Search and Dropdown Filtering</w:t>
+        <w:t>4.12 Dual-Mode Authentication and Role-Based Access Control</w:t>
       </w:r>
       <w:r>
         <w:rPr>
@@ -2365,46 +2365,7 @@
           <w:color w:val="334155"/>
         </w:rPr>
         <w:tab/>
-        <w:t>27</w:t>
-      </w:r>
-    </w:p>
-    <w:p>
-      <w:pPr>
-        <w:tabs>
-          <w:tab w:val="right" w:leader="dot" w:pos="9360"/>
-        </w:tabs>
-        <w:spacing w:before="30" w:after="30" w:line="240" w:lineRule="auto"/>
-        <w:rPr>
-          <w:rFonts w:ascii="Times New Roman" w:hAnsi="Times New Roman" w:cs="Times New Roman"/>
-          <w:b/>
-          <w:bCs/>
-          <w:sz w:val="23"/>
-          <w:szCs w:val="23"/>
-          <w:color w:val="0F172A"/>
-        </w:rPr>
-      </w:pPr>
-      <w:r>
-        <w:rPr>
-          <w:rFonts w:ascii="Times New Roman" w:hAnsi="Times New Roman" w:cs="Times New Roman"/>
-          <w:b/>
-          <w:bCs/>
-          <w:sz w:val="23"/>
-          <w:szCs w:val="23"/>
-          <w:color w:val="0F172A"/>
-        </w:rPr>
-        <w:t>Chapter 5: Results and Discussion</w:t>
-      </w:r>
-      <w:r>
-        <w:rPr>
-          <w:rFonts w:ascii="Times New Roman" w:hAnsi="Times New Roman" w:cs="Times New Roman"/>
-          <w:b/>
-          <w:bCs/>
-          <w:sz w:val="23"/>
-          <w:szCs w:val="23"/>
-          <w:color w:val="0F172A"/>
-        </w:rPr>
-        <w:tab/>
-        <w:t>28</w:t>
+        <w:t>26</w:t>
       </w:r>
     </w:p>
     <w:p>
@@ -2428,14 +2389,53 @@
           <w:szCs w:val="22"/>
           <w:color w:val="334155"/>
         </w:rPr>
-        <w:t>5.1 Presentation of Results</w:t>
-      </w:r>
-      <w:r>
-        <w:rPr>
-          <w:rFonts w:ascii="Times New Roman" w:hAnsi="Times New Roman" w:cs="Times New Roman"/>
-          <w:sz w:val="22"/>
-          <w:szCs w:val="22"/>
-          <w:color w:val="334155"/>
+        <w:t>4.13 Live Global Search and Dropdown Filtering</w:t>
+      </w:r>
+      <w:r>
+        <w:rPr>
+          <w:rFonts w:ascii="Times New Roman" w:hAnsi="Times New Roman" w:cs="Times New Roman"/>
+          <w:sz w:val="22"/>
+          <w:szCs w:val="22"/>
+          <w:color w:val="334155"/>
+        </w:rPr>
+        <w:tab/>
+        <w:t>27</w:t>
+      </w:r>
+    </w:p>
+    <w:p>
+      <w:pPr>
+        <w:tabs>
+          <w:tab w:val="right" w:leader="dot" w:pos="9360"/>
+        </w:tabs>
+        <w:spacing w:before="30" w:after="30" w:line="240" w:lineRule="auto"/>
+        <w:rPr>
+          <w:rFonts w:ascii="Times New Roman" w:hAnsi="Times New Roman" w:cs="Times New Roman"/>
+          <w:b/>
+          <w:bCs/>
+          <w:sz w:val="23"/>
+          <w:szCs w:val="23"/>
+          <w:color w:val="0F172A"/>
+        </w:rPr>
+      </w:pPr>
+      <w:r>
+        <w:rPr>
+          <w:rFonts w:ascii="Times New Roman" w:hAnsi="Times New Roman" w:cs="Times New Roman"/>
+          <w:b/>
+          <w:bCs/>
+          <w:sz w:val="23"/>
+          <w:szCs w:val="23"/>
+          <w:color w:val="0F172A"/>
+        </w:rPr>
+        <w:t>Chapter 5: Results and Discussion</w:t>
+      </w:r>
+      <w:r>
+        <w:rPr>
+          <w:rFonts w:ascii="Times New Roman" w:hAnsi="Times New Roman" w:cs="Times New Roman"/>
+          <w:b/>
+          <w:bCs/>
+          <w:sz w:val="23"/>
+          <w:szCs w:val="23"/>
+          <w:color w:val="0F172A"/>
         </w:rPr>
         <w:tab/>
         <w:t>28</w:t>
@@ -2462,7 +2462,7 @@
           <w:szCs w:val="22"/>
           <w:color w:val="334155"/>
         </w:rPr>
-        <w:t>5.2 Discussion of Findings</w:t>
+        <w:t>5.1 Presentation of Results</w:t>
       </w:r>
       <w:r>
         <w:rPr>
@@ -2496,7 +2496,7 @@
           <w:szCs w:val="22"/>
           <w:color w:val="334155"/>
         </w:rPr>
-        <w:t>5.3 Testing and Validation</w:t>
+        <w:t>5.2 Discussion of Findings</w:t>
       </w:r>
       <w:r>
         <w:rPr>
@@ -2506,46 +2506,7 @@
           <w:color w:val="334155"/>
         </w:rPr>
         <w:tab/>
-        <w:t>29</w:t>
-      </w:r>
-    </w:p>
-    <w:p>
-      <w:pPr>
-        <w:tabs>
-          <w:tab w:val="right" w:leader="dot" w:pos="9360"/>
-        </w:tabs>
-        <w:spacing w:before="30" w:after="30" w:line="240" w:lineRule="auto"/>
-        <w:rPr>
-          <w:rFonts w:ascii="Times New Roman" w:hAnsi="Times New Roman" w:cs="Times New Roman"/>
-          <w:b/>
-          <w:bCs/>
-          <w:sz w:val="23"/>
-          <w:szCs w:val="23"/>
-          <w:color w:val="0F172A"/>
-        </w:rPr>
-      </w:pPr>
-      <w:r>
-        <w:rPr>
-          <w:rFonts w:ascii="Times New Roman" w:hAnsi="Times New Roman" w:cs="Times New Roman"/>
-          <w:b/>
-          <w:bCs/>
-          <w:sz w:val="23"/>
-          <w:szCs w:val="23"/>
-          <w:color w:val="0F172A"/>
-        </w:rPr>
-        <w:t>Chapter 6: Conclusion</w:t>
-      </w:r>
-      <w:r>
-        <w:rPr>
-          <w:rFonts w:ascii="Times New Roman" w:hAnsi="Times New Roman" w:cs="Times New Roman"/>
-          <w:b/>
-          <w:bCs/>
-          <w:sz w:val="23"/>
-          <w:szCs w:val="23"/>
-          <w:color w:val="0F172A"/>
-        </w:rPr>
-        <w:tab/>
-        <w:t>31</w:t>
+        <w:t>28</w:t>
       </w:r>
     </w:p>
     <w:p>
@@ -2569,14 +2530,53 @@
           <w:szCs w:val="22"/>
           <w:color w:val="334155"/>
         </w:rPr>
-        <w:t>6.1 Summary of Project Work</w:t>
-      </w:r>
-      <w:r>
-        <w:rPr>
-          <w:rFonts w:ascii="Times New Roman" w:hAnsi="Times New Roman" w:cs="Times New Roman"/>
-          <w:sz w:val="22"/>
-          <w:szCs w:val="22"/>
-          <w:color w:val="334155"/>
+        <w:t>5.3 Testing and Validation</w:t>
+      </w:r>
+      <w:r>
+        <w:rPr>
+          <w:rFonts w:ascii="Times New Roman" w:hAnsi="Times New Roman" w:cs="Times New Roman"/>
+          <w:sz w:val="22"/>
+          <w:szCs w:val="22"/>
+          <w:color w:val="334155"/>
+        </w:rPr>
+        <w:tab/>
+        <w:t>29</w:t>
+      </w:r>
+    </w:p>
+    <w:p>
+      <w:pPr>
+        <w:tabs>
+          <w:tab w:val="right" w:leader="dot" w:pos="9360"/>
+        </w:tabs>
+        <w:spacing w:before="30" w:after="30" w:line="240" w:lineRule="auto"/>
+        <w:rPr>
+          <w:rFonts w:ascii="Times New Roman" w:hAnsi="Times New Roman" w:cs="Times New Roman"/>
+          <w:b/>
+          <w:bCs/>
+          <w:sz w:val="23"/>
+          <w:szCs w:val="23"/>
+          <w:color w:val="0F172A"/>
+        </w:rPr>
+      </w:pPr>
+      <w:r>
+        <w:rPr>
+          <w:rFonts w:ascii="Times New Roman" w:hAnsi="Times New Roman" w:cs="Times New Roman"/>
+          <w:b/>
+          <w:bCs/>
+          <w:sz w:val="23"/>
+          <w:szCs w:val="23"/>
+          <w:color w:val="0F172A"/>
+        </w:rPr>
+        <w:t>Chapter 6: Conclusion</w:t>
+      </w:r>
+      <w:r>
+        <w:rPr>
+          <w:rFonts w:ascii="Times New Roman" w:hAnsi="Times New Roman" w:cs="Times New Roman"/>
+          <w:b/>
+          <w:bCs/>
+          <w:sz w:val="23"/>
+          <w:szCs w:val="23"/>
+          <w:color w:val="0F172A"/>
         </w:rPr>
         <w:tab/>
         <w:t>31</w:t>
@@ -2603,7 +2603,7 @@
           <w:szCs w:val="22"/>
           <w:color w:val="334155"/>
         </w:rPr>
-        <w:t>6.2 Achievement of Project Objectives</w:t>
+        <w:t>6.1 Summary of Project Work</w:t>
       </w:r>
       <w:r>
         <w:rPr>
@@ -2637,7 +2637,7 @@
           <w:szCs w:val="22"/>
           <w:color w:val="334155"/>
         </w:rPr>
-        <w:t>6.3 Lessons Learned</w:t>
+        <w:t>6.2 Achievement of Project Objectives</w:t>
       </w:r>
       <w:r>
         <w:rPr>
@@ -2647,46 +2647,7 @@
           <w:color w:val="334155"/>
         </w:rPr>
         <w:tab/>
-        <w:t>32</w:t>
-      </w:r>
-    </w:p>
-    <w:p>
-      <w:pPr>
-        <w:tabs>
-          <w:tab w:val="right" w:leader="dot" w:pos="9360"/>
-        </w:tabs>
-        <w:spacing w:before="30" w:after="30" w:line="240" w:lineRule="auto"/>
-        <w:rPr>
-          <w:rFonts w:ascii="Times New Roman" w:hAnsi="Times New Roman" w:cs="Times New Roman"/>
-          <w:b/>
-          <w:bCs/>
-          <w:sz w:val="23"/>
-          <w:szCs w:val="23"/>
-          <w:color w:val="0F172A"/>
-        </w:rPr>
-      </w:pPr>
-      <w:r>
-        <w:rPr>
-          <w:rFonts w:ascii="Times New Roman" w:hAnsi="Times New Roman" w:cs="Times New Roman"/>
-          <w:b/>
-          <w:bCs/>
-          <w:sz w:val="23"/>
-          <w:szCs w:val="23"/>
-          <w:color w:val="0F172A"/>
-        </w:rPr>
-        <w:t>Chapter 7: Future Work</w:t>
-      </w:r>
-      <w:r>
-        <w:rPr>
-          <w:rFonts w:ascii="Times New Roman" w:hAnsi="Times New Roman" w:cs="Times New Roman"/>
-          <w:b/>
-          <w:bCs/>
-          <w:sz w:val="23"/>
-          <w:szCs w:val="23"/>
-          <w:color w:val="0F172A"/>
-        </w:rPr>
-        <w:tab/>
-        <w:t>33</w:t>
+        <w:t>31</w:t>
       </w:r>
     </w:p>
     <w:p>
@@ -2710,14 +2671,53 @@
           <w:szCs w:val="22"/>
           <w:color w:val="334155"/>
         </w:rPr>
-        <w:t>7.1 Suggestions for Future Enhancements</w:t>
-      </w:r>
-      <w:r>
-        <w:rPr>
-          <w:rFonts w:ascii="Times New Roman" w:hAnsi="Times New Roman" w:cs="Times New Roman"/>
-          <w:sz w:val="22"/>
-          <w:szCs w:val="22"/>
-          <w:color w:val="334155"/>
+        <w:t>6.3 Lessons Learned</w:t>
+      </w:r>
+      <w:r>
+        <w:rPr>
+          <w:rFonts w:ascii="Times New Roman" w:hAnsi="Times New Roman" w:cs="Times New Roman"/>
+          <w:sz w:val="22"/>
+          <w:szCs w:val="22"/>
+          <w:color w:val="334155"/>
+        </w:rPr>
+        <w:tab/>
+        <w:t>32</w:t>
+      </w:r>
+    </w:p>
+    <w:p>
+      <w:pPr>
+        <w:tabs>
+          <w:tab w:val="right" w:leader="dot" w:pos="9360"/>
+        </w:tabs>
+        <w:spacing w:before="30" w:after="30" w:line="240" w:lineRule="auto"/>
+        <w:rPr>
+          <w:rFonts w:ascii="Times New Roman" w:hAnsi="Times New Roman" w:cs="Times New Roman"/>
+          <w:b/>
+          <w:bCs/>
+          <w:sz w:val="23"/>
+          <w:szCs w:val="23"/>
+          <w:color w:val="0F172A"/>
+        </w:rPr>
+      </w:pPr>
+      <w:r>
+        <w:rPr>
+          <w:rFonts w:ascii="Times New Roman" w:hAnsi="Times New Roman" w:cs="Times New Roman"/>
+          <w:b/>
+          <w:bCs/>
+          <w:sz w:val="23"/>
+          <w:szCs w:val="23"/>
+          <w:color w:val="0F172A"/>
+        </w:rPr>
+        <w:t>Chapter 7: Future Work</w:t>
+      </w:r>
+      <w:r>
+        <w:rPr>
+          <w:rFonts w:ascii="Times New Roman" w:hAnsi="Times New Roman" w:cs="Times New Roman"/>
+          <w:b/>
+          <w:bCs/>
+          <w:sz w:val="23"/>
+          <w:szCs w:val="23"/>
+          <w:color w:val="0F172A"/>
         </w:rPr>
         <w:tab/>
         <w:t>33</w:t>
@@ -2744,7 +2744,7 @@
           <w:szCs w:val="22"/>
           <w:color w:val="334155"/>
         </w:rPr>
-        <w:t>7.2 Areas for Further Research</w:t>
+        <w:t>7.1 Suggestions for Future Enhancements</w:t>
       </w:r>
       <w:r>
         <w:rPr>
@@ -2759,70 +2759,36 @@
     </w:p>
     <w:p>
       <w:pPr>
+        <w:ind w:left="360"/>
         <w:tabs>
           <w:tab w:val="right" w:leader="dot" w:pos="9360"/>
         </w:tabs>
         <w:spacing w:before="30" w:after="30" w:line="240" w:lineRule="auto"/>
         <w:rPr>
           <w:rFonts w:ascii="Times New Roman" w:hAnsi="Times New Roman" w:cs="Times New Roman"/>
-          <w:b/>
-          <w:bCs/>
-          <w:sz w:val="23"/>
-          <w:szCs w:val="23"/>
-          <w:color w:val="0F172A"/>
-        </w:rPr>
-      </w:pPr>
-      <w:r>
-        <w:rPr>
-          <w:rFonts w:ascii="Times New Roman" w:hAnsi="Times New Roman" w:cs="Times New Roman"/>
-          <w:b/>
-          <w:bCs/>
-          <w:sz w:val="23"/>
-          <w:szCs w:val="23"/>
-          <w:color w:val="0F172A"/>
-        </w:rPr>
-        <w:t>References</w:t>
-      </w:r>
-      <w:r>
-        <w:rPr>
-          <w:rFonts w:ascii="Times New Roman" w:hAnsi="Times New Roman" w:cs="Times New Roman"/>
-          <w:b/>
-          <w:bCs/>
-          <w:sz w:val="23"/>
-          <w:szCs w:val="23"/>
-          <w:color w:val="0F172A"/>
+          <w:sz w:val="22"/>
+          <w:szCs w:val="22"/>
+          <w:color w:val="334155"/>
+        </w:rPr>
+      </w:pPr>
+      <w:r>
+        <w:rPr>
+          <w:rFonts w:ascii="Times New Roman" w:hAnsi="Times New Roman" w:cs="Times New Roman"/>
+          <w:sz w:val="22"/>
+          <w:szCs w:val="22"/>
+          <w:color w:val="334155"/>
+        </w:rPr>
+        <w:t>7.2 Areas for Further Research</w:t>
+      </w:r>
+      <w:r>
+        <w:rPr>
+          <w:rFonts w:ascii="Times New Roman" w:hAnsi="Times New Roman" w:cs="Times New Roman"/>
+          <w:sz w:val="22"/>
+          <w:szCs w:val="22"/>
+          <w:color w:val="334155"/>
         </w:rPr>
         <w:tab/>
-        <w:t>34</w:t>
-      </w:r>
-    </w:p>
-    <w:p>
-      <w:r>
-        <w:br w:type="page"/>
-      </w:r>
-    </w:p>
-    <w:p>
-      <w:pPr>
-        <w:spacing w:before="320" w:after="140" w:line="280" w:lineRule="auto"/>
-        <w:rPr>
-          <w:rFonts w:ascii="Times New Roman" w:hAnsi="Times New Roman" w:cs="Times New Roman"/>
-          <w:b/>
-          <w:bCs/>
-          <w:sz w:val="32"/>
-          <w:szCs w:val="32"/>
-          <w:color w:val="0F172A"/>
-        </w:rPr>
-      </w:pPr>
-      <w:r>
-        <w:rPr>
-          <w:rFonts w:ascii="Times New Roman" w:hAnsi="Times New Roman" w:cs="Times New Roman"/>
-          <w:b/>
-          <w:bCs/>
-          <w:sz w:val="32"/>
-          <w:szCs w:val="32"/>
-          <w:color w:val="0F172A"/>
-        </w:rPr>
-        <w:t>List of Figures</w:t>
+        <w:t>33</w:t>
       </w:r>
     </w:p>
     <w:p>
@@ -2833,29 +2799,64 @@
         <w:spacing w:before="30" w:after="30" w:line="240" w:lineRule="auto"/>
         <w:rPr>
           <w:rFonts w:ascii="Times New Roman" w:hAnsi="Times New Roman" w:cs="Times New Roman"/>
-          <w:sz w:val="22"/>
-          <w:szCs w:val="22"/>
-          <w:color w:val="334155"/>
-        </w:rPr>
-      </w:pPr>
-      <w:r>
-        <w:rPr>
-          <w:rFonts w:ascii="Times New Roman" w:hAnsi="Times New Roman" w:cs="Times New Roman"/>
-          <w:sz w:val="22"/>
-          <w:szCs w:val="22"/>
-          <w:color w:val="334155"/>
-        </w:rPr>
-        <w:t>Figure 3.1: Entity-Relationship (ER) Diagram for CricketTournamentDB</w:t>
-      </w:r>
-      <w:r>
-        <w:rPr>
-          <w:rFonts w:ascii="Times New Roman" w:hAnsi="Times New Roman" w:cs="Times New Roman"/>
-          <w:sz w:val="22"/>
-          <w:szCs w:val="22"/>
-          <w:color w:val="334155"/>
+          <w:b/>
+          <w:bCs/>
+          <w:sz w:val="23"/>
+          <w:szCs w:val="23"/>
+          <w:color w:val="0F172A"/>
+        </w:rPr>
+      </w:pPr>
+      <w:r>
+        <w:rPr>
+          <w:rFonts w:ascii="Times New Roman" w:hAnsi="Times New Roman" w:cs="Times New Roman"/>
+          <w:b/>
+          <w:bCs/>
+          <w:sz w:val="23"/>
+          <w:szCs w:val="23"/>
+          <w:color w:val="0F172A"/>
+        </w:rPr>
+        <w:t>References</w:t>
+      </w:r>
+      <w:r>
+        <w:rPr>
+          <w:rFonts w:ascii="Times New Roman" w:hAnsi="Times New Roman" w:cs="Times New Roman"/>
+          <w:b/>
+          <w:bCs/>
+          <w:sz w:val="23"/>
+          <w:szCs w:val="23"/>
+          <w:color w:val="0F172A"/>
         </w:rPr>
         <w:tab/>
-        <w:t>8</w:t>
+        <w:t>34</w:t>
+      </w:r>
+    </w:p>
+    <w:p>
+      <w:r>
+        <w:br w:type="page"/>
+      </w:r>
+    </w:p>
+    <w:p>
+      <w:pPr>
+        <w:spacing w:before="320" w:after="140" w:line="280" w:lineRule="auto"/>
+        <w:rPr>
+          <w:rFonts w:ascii="Times New Roman" w:hAnsi="Times New Roman" w:cs="Times New Roman"/>
+          <w:b/>
+          <w:bCs/>
+          <w:sz w:val="32"/>
+          <w:szCs w:val="32"/>
+          <w:color w:val="0F172A"/>
+        </w:rPr>
+      </w:pPr>
+      <w:r>
+        <w:rPr>
+          <w:rFonts w:ascii="Times New Roman" w:hAnsi="Times New Roman" w:cs="Times New Roman"/>
+          <w:b/>
+          <w:bCs/>
+          <w:sz w:val="32"/>
+          <w:szCs w:val="32"/>
+          <w:color w:val="0F172A"/>
+        </w:rPr>
+        <w:t>List of Figures</w:t>
       </w:r>
     </w:p>
     <w:p>
@@ -2878,7 +2879,7 @@
           <w:szCs w:val="22"/>
           <w:color w:val="334155"/>
         </w:rPr>
-        <w:t>Figure 4.1: MySQL Terminal Verification — SHOW TABLES in CricketTournamentDB</w:t>
+        <w:t>Figure 3.1: Entity-Relationship (ER) Diagram for CricketTournamentDB</w:t>
       </w:r>
       <w:r>
         <w:rPr>
@@ -2888,7 +2889,7 @@
           <w:color w:val="334155"/>
         </w:rPr>
         <w:tab/>
-        <w:t>15</w:t>
+        <w:t>8</w:t>
       </w:r>
     </w:p>
     <w:p>
@@ -2911,7 +2912,7 @@
           <w:szCs w:val="22"/>
           <w:color w:val="334155"/>
         </w:rPr>
-        <w:t>Figure 4.2: MySQL Schema Structure — DESCRIBE CricketTeam and CricketPlayer</w:t>
+        <w:t>Figure 4.1: MySQL Terminal Verification — SHOW TABLES in CricketTournamentDB</w:t>
       </w:r>
       <w:r>
         <w:rPr>
@@ -2921,7 +2922,7 @@
           <w:color w:val="334155"/>
         </w:rPr>
         <w:tab/>
-        <w:t>16</w:t>
+        <w:t>15</w:t>
       </w:r>
     </w:p>
     <w:p>
@@ -2944,7 +2945,7 @@
           <w:szCs w:val="22"/>
           <w:color w:val="334155"/>
         </w:rPr>
-        <w:t>Figure 4.3: CricketBuddy Tournament Executive Dashboard &amp; KPI Metrics</w:t>
+        <w:t>Figure 4.2: MySQL Schema Structure — DESCRIBE CricketTeam and CricketPlayer</w:t>
       </w:r>
       <w:r>
         <w:rPr>
@@ -2954,7 +2955,7 @@
           <w:color w:val="334155"/>
         </w:rPr>
         <w:tab/>
-        <w:t>17</w:t>
+        <w:t>16</w:t>
       </w:r>
     </w:p>
     <w:p>
@@ -2977,7 +2978,7 @@
           <w:szCs w:val="22"/>
           <w:color w:val="334155"/>
         </w:rPr>
-        <w:t>Figure 4.4: Team Management Roster &amp; Franchise Profiles</w:t>
+        <w:t>Figure 4.3: CricketBuddy Tournament Executive Dashboard &amp; KPI Metrics</w:t>
       </w:r>
       <w:r>
         <w:rPr>
@@ -2987,7 +2988,7 @@
           <w:color w:val="334155"/>
         </w:rPr>
         <w:tab/>
-        <w:t>18</w:t>
+        <w:t>17</w:t>
       </w:r>
     </w:p>
     <w:p>
@@ -3010,7 +3011,7 @@
           <w:szCs w:val="22"/>
           <w:color w:val="334155"/>
         </w:rPr>
-        <w:t>Figure 4.5: Player Squad Roster with Role Badges &amp; Team Affiliations</w:t>
+        <w:t>Figure 4.4: Team Management Roster &amp; Franchise Profiles</w:t>
       </w:r>
       <w:r>
         <w:rPr>
@@ -3020,7 +3021,7 @@
           <w:color w:val="334155"/>
         </w:rPr>
         <w:tab/>
-        <w:t>19</w:t>
+        <w:t>18</w:t>
       </w:r>
     </w:p>
     <w:p>
@@ -3043,7 +3044,7 @@
           <w:szCs w:val="22"/>
           <w:color w:val="334155"/>
         </w:rPr>
-        <w:t>Figure 4.6: Tournament Matches &amp; Fixture Scheduling Module</w:t>
+        <w:t>Figure 4.5: Player Squad Roster with Role Badges &amp; Team Affiliations</w:t>
       </w:r>
       <w:r>
         <w:rPr>
@@ -3053,7 +3054,7 @@
           <w:color w:val="334155"/>
         </w:rPr>
         <w:tab/>
-        <w:t>20</w:t>
+        <w:t>19</w:t>
       </w:r>
     </w:p>
     <w:p>
@@ -3076,7 +3077,7 @@
           <w:szCs w:val="22"/>
           <w:color w:val="334155"/>
         </w:rPr>
-        <w:t>Figure 4.7: Match Scorecards &amp; Batting/Bowling Performance Tracking</w:t>
+        <w:t>Figure 4.6: Tournament Matches &amp; Fixture Scheduling Module</w:t>
       </w:r>
       <w:r>
         <w:rPr>
@@ -3086,7 +3087,7 @@
           <w:color w:val="334155"/>
         </w:rPr>
         <w:tab/>
-        <w:t>21</w:t>
+        <w:t>20</w:t>
       </w:r>
     </w:p>
     <w:p>
@@ -3109,7 +3110,7 @@
           <w:szCs w:val="22"/>
           <w:color w:val="334155"/>
         </w:rPr>
-        <w:t>Figure 4.8: Stadiums and Host Venues Management Interface</w:t>
+        <w:t>Figure 4.7: Match Scorecards &amp; Batting/Bowling Performance Tracking</w:t>
       </w:r>
       <w:r>
         <w:rPr>
@@ -3119,7 +3120,7 @@
           <w:color w:val="334155"/>
         </w:rPr>
         <w:tab/>
-        <w:t>22</w:t>
+        <w:t>21</w:t>
       </w:r>
     </w:p>
     <w:p>
@@ -3142,7 +3143,7 @@
           <w:szCs w:val="22"/>
           <w:color w:val="334155"/>
         </w:rPr>
-        <w:t>Figure 4.9: Tournament Analytics &amp; Queries (Top Run Scorers, Squad Sizes, Sponsorships)</w:t>
+        <w:t>Figure 4.8: Stadiums and Host Venues Management Interface</w:t>
       </w:r>
       <w:r>
         <w:rPr>
@@ -3152,7 +3153,7 @@
           <w:color w:val="334155"/>
         </w:rPr>
         <w:tab/>
-        <w:t>23</w:t>
+        <w:t>22</w:t>
       </w:r>
     </w:p>
     <w:p>
@@ -3175,7 +3176,7 @@
           <w:szCs w:val="22"/>
           <w:color w:val="334155"/>
         </w:rPr>
-        <w:t>Figure 4.10: Commercial Team Sponsorships &amp; Contract Valuations View</w:t>
+        <w:t>Figure 4.9: Tournament Analytics &amp; Queries (Top Run Scorers, Squad Sizes, Sponsorships)</w:t>
       </w:r>
       <w:r>
         <w:rPr>
@@ -3185,7 +3186,7 @@
           <w:color w:val="334155"/>
         </w:rPr>
         <w:tab/>
-        <w:t>24</w:t>
+        <w:t>23</w:t>
       </w:r>
     </w:p>
     <w:p>
@@ -3208,7 +3209,7 @@
           <w:szCs w:val="22"/>
           <w:color w:val="334155"/>
         </w:rPr>
-        <w:t>Figure 4.11: Certified Match Referees and Umpires Directory</w:t>
+        <w:t>Figure 4.10: Commercial Team Sponsorships &amp; Contract Valuations View</w:t>
       </w:r>
       <w:r>
         <w:rPr>
@@ -3218,7 +3219,7 @@
           <w:color w:val="334155"/>
         </w:rPr>
         <w:tab/>
-        <w:t>25</w:t>
+        <w:t>24</w:t>
       </w:r>
     </w:p>
     <w:p>
@@ -3241,7 +3242,7 @@
           <w:szCs w:val="22"/>
           <w:color w:val="334155"/>
         </w:rPr>
-        <w:t>Figure 4.12: Dual-Mode Role-Based Authentication Modal (Admin vs Viewer)</w:t>
+        <w:t>Figure 4.11: Certified Match Referees and Umpires Directory</w:t>
       </w:r>
       <w:r>
         <w:rPr>
@@ -3251,7 +3252,7 @@
           <w:color w:val="334155"/>
         </w:rPr>
         <w:tab/>
-        <w:t>26</w:t>
+        <w:t>25</w:t>
       </w:r>
     </w:p>
     <w:p>
@@ -3274,7 +3275,7 @@
           <w:szCs w:val="22"/>
           <w:color w:val="334155"/>
         </w:rPr>
-        <w:t>Figure 4.13: Live Global Search &amp; Real-Time Dropdown Filtering</w:t>
+        <w:t>Figure 4.12: Dual-Mode Role-Based Authentication Modal (Admin vs Viewer)</w:t>
       </w:r>
       <w:r>
         <w:rPr>
@@ -3284,45 +3285,7 @@
           <w:color w:val="334155"/>
         </w:rPr>
         <w:tab/>
-        <w:t>27</w:t>
-      </w:r>
-    </w:p>
-    <w:p>
-      <w:pPr>
-        <w:spacing w:before="0" w:after="140" w:line="276" w:lineRule="auto"/>
-        <w:rPr>
-          <w:rFonts w:ascii="Times New Roman" w:hAnsi="Times New Roman" w:cs="Times New Roman"/>
-        </w:rPr>
-      </w:pPr>
-      <w:r>
-        <w:rPr>
-          <w:rFonts w:ascii="Times New Roman" w:hAnsi="Times New Roman" w:cs="Times New Roman"/>
-        </w:rPr>
-        <w:t xml:space="preserve"/>
-      </w:r>
-    </w:p>
-    <w:p>
-      <w:pPr>
-        <w:spacing w:before="320" w:after="140" w:line="280" w:lineRule="auto"/>
-        <w:rPr>
-          <w:rFonts w:ascii="Times New Roman" w:hAnsi="Times New Roman" w:cs="Times New Roman"/>
-          <w:b/>
-          <w:bCs/>
-          <w:sz w:val="32"/>
-          <w:szCs w:val="32"/>
-          <w:color w:val="0F172A"/>
-        </w:rPr>
-      </w:pPr>
-      <w:r>
-        <w:rPr>
-          <w:rFonts w:ascii="Times New Roman" w:hAnsi="Times New Roman" w:cs="Times New Roman"/>
-          <w:b/>
-          <w:bCs/>
-          <w:sz w:val="32"/>
-          <w:szCs w:val="32"/>
-          <w:color w:val="0F172A"/>
-        </w:rPr>
-        <w:t>List of Tables</w:t>
+        <w:t>26</w:t>
       </w:r>
     </w:p>
     <w:p>
@@ -3345,7 +3308,7 @@
           <w:szCs w:val="22"/>
           <w:color w:val="334155"/>
         </w:rPr>
-        <w:t>Table 3.1: CricketTeam Table Schema</w:t>
+        <w:t>Figure 4.13: Live Global Search &amp; Real-Time Dropdown Filtering</w:t>
       </w:r>
       <w:r>
         <w:rPr>
@@ -3355,7 +3318,45 @@
           <w:color w:val="334155"/>
         </w:rPr>
         <w:tab/>
-        <w:t>9</w:t>
+        <w:t>27</w:t>
+      </w:r>
+    </w:p>
+    <w:p>
+      <w:pPr>
+        <w:spacing w:before="0" w:after="140" w:line="276" w:lineRule="auto"/>
+        <w:rPr>
+          <w:rFonts w:ascii="Times New Roman" w:hAnsi="Times New Roman" w:cs="Times New Roman"/>
+        </w:rPr>
+      </w:pPr>
+      <w:r>
+        <w:rPr>
+          <w:rFonts w:ascii="Times New Roman" w:hAnsi="Times New Roman" w:cs="Times New Roman"/>
+        </w:rPr>
+        <w:t xml:space="preserve"/>
+      </w:r>
+    </w:p>
+    <w:p>
+      <w:pPr>
+        <w:spacing w:before="320" w:after="140" w:line="280" w:lineRule="auto"/>
+        <w:rPr>
+          <w:rFonts w:ascii="Times New Roman" w:hAnsi="Times New Roman" w:cs="Times New Roman"/>
+          <w:b/>
+          <w:bCs/>
+          <w:sz w:val="32"/>
+          <w:szCs w:val="32"/>
+          <w:color w:val="0F172A"/>
+        </w:rPr>
+      </w:pPr>
+      <w:r>
+        <w:rPr>
+          <w:rFonts w:ascii="Times New Roman" w:hAnsi="Times New Roman" w:cs="Times New Roman"/>
+          <w:b/>
+          <w:bCs/>
+          <w:sz w:val="32"/>
+          <w:szCs w:val="32"/>
+          <w:color w:val="0F172A"/>
+        </w:rPr>
+        <w:t>List of Tables</w:t>
       </w:r>
     </w:p>
     <w:p>
@@ -3378,7 +3379,7 @@
           <w:szCs w:val="22"/>
           <w:color w:val="334155"/>
         </w:rPr>
-        <w:t>Table 3.2: CricketStadium Table Schema</w:t>
+        <w:t>Table 3.1: CricketTeam Table Schema</w:t>
       </w:r>
       <w:r>
         <w:rPr>
@@ -3411,7 +3412,7 @@
           <w:szCs w:val="22"/>
           <w:color w:val="334155"/>
         </w:rPr>
-        <w:t>Table 3.3: CricketPlayer Table Schema</w:t>
+        <w:t>Table 3.2: CricketStadium Table Schema</w:t>
       </w:r>
       <w:r>
         <w:rPr>
@@ -3421,7 +3422,7 @@
           <w:color w:val="334155"/>
         </w:rPr>
         <w:tab/>
-        <w:t>10</w:t>
+        <w:t>9</w:t>
       </w:r>
     </w:p>
     <w:p>
@@ -3444,7 +3445,7 @@
           <w:szCs w:val="22"/>
           <w:color w:val="334155"/>
         </w:rPr>
-        <w:t>Table 3.4: CricketUmpire Table Schema</w:t>
+        <w:t>Table 3.3: CricketPlayer Table Schema</w:t>
       </w:r>
       <w:r>
         <w:rPr>
@@ -3477,7 +3478,7 @@
           <w:szCs w:val="22"/>
           <w:color w:val="334155"/>
         </w:rPr>
-        <w:t>Table 3.5: TournamentMatch Table Schema</w:t>
+        <w:t>Table 3.4: CricketUmpire Table Schema</w:t>
       </w:r>
       <w:r>
         <w:rPr>
@@ -3487,7 +3488,7 @@
           <w:color w:val="334155"/>
         </w:rPr>
         <w:tab/>
-        <w:t>11</w:t>
+        <w:t>10</w:t>
       </w:r>
     </w:p>
     <w:p>
@@ -3510,7 +3511,7 @@
           <w:szCs w:val="22"/>
           <w:color w:val="334155"/>
         </w:rPr>
-        <w:t>Table 3.6: TeamSponsor Table Schema</w:t>
+        <w:t>Table 3.5: TournamentMatch Table Schema</w:t>
       </w:r>
       <w:r>
         <w:rPr>
@@ -3543,7 +3544,7 @@
           <w:szCs w:val="22"/>
           <w:color w:val="334155"/>
         </w:rPr>
-        <w:t>Table 3.7: MatchScorecard Table Schema</w:t>
+        <w:t>Table 3.6: TeamSponsor Table Schema</w:t>
       </w:r>
       <w:r>
         <w:rPr>
@@ -3553,7 +3554,7 @@
           <w:color w:val="334155"/>
         </w:rPr>
         <w:tab/>
-        <w:t>12</w:t>
+        <w:t>11</w:t>
       </w:r>
     </w:p>
     <w:p>
@@ -3576,7 +3577,7 @@
           <w:szCs w:val="22"/>
           <w:color w:val="334155"/>
         </w:rPr>
-        <w:t>Table 3.8: TeamParticipation Table Schema</w:t>
+        <w:t>Table 3.7: MatchScorecard Table Schema</w:t>
       </w:r>
       <w:r>
         <w:rPr>
@@ -3609,7 +3610,7 @@
           <w:szCs w:val="22"/>
           <w:color w:val="334155"/>
         </w:rPr>
-        <w:t>Table 3.9: MatchOfficials Table Schema</w:t>
+        <w:t>Table 3.8: TeamParticipation Table Schema</w:t>
       </w:r>
       <w:r>
         <w:rPr>
@@ -3620,6 +3621,72 @@
         </w:rPr>
         <w:tab/>
         <w:t>12</w:t>
+      </w:r>
+    </w:p>
+    <w:p>
+      <w:pPr>
+        <w:tabs>
+          <w:tab w:val="right" w:leader="dot" w:pos="9360"/>
+        </w:tabs>
+        <w:spacing w:before="30" w:after="30" w:line="240" w:lineRule="auto"/>
+        <w:rPr>
+          <w:rFonts w:ascii="Times New Roman" w:hAnsi="Times New Roman" w:cs="Times New Roman"/>
+          <w:sz w:val="22"/>
+          <w:szCs w:val="22"/>
+          <w:color w:val="334155"/>
+        </w:rPr>
+      </w:pPr>
+      <w:r>
+        <w:rPr>
+          <w:rFonts w:ascii="Times New Roman" w:hAnsi="Times New Roman" w:cs="Times New Roman"/>
+          <w:sz w:val="22"/>
+          <w:szCs w:val="22"/>
+          <w:color w:val="334155"/>
+        </w:rPr>
+        <w:t>Table 3.9: MatchOfficials Table Schema</w:t>
+      </w:r>
+      <w:r>
+        <w:rPr>
+          <w:rFonts w:ascii="Times New Roman" w:hAnsi="Times New Roman" w:cs="Times New Roman"/>
+          <w:sz w:val="22"/>
+          <w:szCs w:val="22"/>
+          <w:color w:val="334155"/>
+        </w:rPr>
+        <w:tab/>
+        <w:t>12</w:t>
+      </w:r>
+    </w:p>
+    <w:p>
+      <w:pPr>
+        <w:tabs>
+          <w:tab w:val="right" w:leader="dot" w:pos="9360"/>
+        </w:tabs>
+        <w:spacing w:before="30" w:after="30" w:line="240" w:lineRule="auto"/>
+        <w:rPr>
+          <w:rFonts w:ascii="Times New Roman" w:hAnsi="Times New Roman" w:cs="Times New Roman"/>
+          <w:sz w:val="22"/>
+          <w:szCs w:val="22"/>
+          <w:color w:val="334155"/>
+        </w:rPr>
+      </w:pPr>
+      <w:r>
+        <w:rPr>
+          <w:rFonts w:ascii="Times New Roman" w:hAnsi="Times New Roman" w:cs="Times New Roman"/>
+          <w:sz w:val="22"/>
+          <w:szCs w:val="22"/>
+          <w:color w:val="334155"/>
+        </w:rPr>
+        <w:t>Table 3.10: Catalog of Database Views in CricketTournamentDB</w:t>
+      </w:r>
+      <w:r>
+        <w:rPr>
+          <w:rFonts w:ascii="Times New Roman" w:hAnsi="Times New Roman" w:cs="Times New Roman"/>
+          <w:sz w:val="22"/>
+          <w:szCs w:val="22"/>
+          <w:color w:val="334155"/>
+        </w:rPr>
+        <w:tab/>
+        <w:t>14</w:t>
       </w:r>
     </w:p>
     <w:p>
@@ -4461,7 +4528,7 @@
           <wp:inline distT="0" distB="0" distL="0" distR="0">
             <wp:extent cx="5486400" cy="3550000"/>
             <wp:effectExtent l="0" t="0" r="0" b="0"/>
-            <wp:docPr id="68710272" name="ER Diagram"/>
+            <wp:docPr id="55728212" name="ER Diagram"/>
             <wp:cNvGraphicFramePr>
               <a:graphicFrameLocks xmlns:a="http://schemas.openxmlformats.org/drawingml/2006/main" noChangeAspect="1"/>
             </wp:cNvGraphicFramePr>
@@ -12137,6 +12204,1118 @@
       </w:r>
     </w:p>
     <w:p>
+      <w:pPr>
+        <w:spacing w:before="220" w:after="100" w:line="260" w:lineRule="auto"/>
+        <w:rPr>
+          <w:rFonts w:ascii="Times New Roman" w:hAnsi="Times New Roman" w:cs="Times New Roman"/>
+          <w:b/>
+          <w:bCs/>
+          <w:sz w:val="26"/>
+          <w:szCs w:val="26"/>
+          <w:color w:val="1E293B"/>
+        </w:rPr>
+      </w:pPr>
+      <w:r>
+        <w:rPr>
+          <w:rFonts w:ascii="Times New Roman" w:hAnsi="Times New Roman" w:cs="Times New Roman"/>
+          <w:b/>
+          <w:bCs/>
+          <w:sz w:val="26"/>
+          <w:szCs w:val="26"/>
+          <w:color w:val="1E293B"/>
+        </w:rPr>
+        <w:t>3.6 Database Views (Virtual Tables)</w:t>
+      </w:r>
+    </w:p>
+    <w:p>
+      <w:pPr>
+        <w:jc w:val="both"/>
+        <w:spacing w:before="0" w:after="120" w:line="276" w:lineRule="auto"/>
+        <w:rPr>
+          <w:rFonts w:ascii="Times New Roman" w:hAnsi="Times New Roman" w:cs="Times New Roman"/>
+          <w:color w:val="1E293B"/>
+        </w:rPr>
+      </w:pPr>
+      <w:r>
+        <w:rPr>
+          <w:rFonts w:ascii="Times New Roman" w:hAnsi="Times New Roman" w:cs="Times New Roman"/>
+          <w:color w:val="1E293B"/>
+        </w:rPr>
+        <w:t xml:space="preserve">To resolve multi-table JOIN overhead while strictly preserving Boyce-Codd Normal Form (BCNF) in the foundational tables, seven relational database Views were designed and deployed directly in MySQL under CricketTournamentDB. In relational database theory, a VIEW acts as a pre-compiled virtual relation dynamically produced by the database query optimizer. This provides major system benefits:</w:t>
+      </w:r>
+    </w:p>
+    <w:p>
+      <w:pPr>
+        <w:jc w:val="both"/>
+        <w:ind w:left="360"/>
+        <w:spacing w:before="0" w:after="120" w:line="276" w:lineRule="auto"/>
+        <w:rPr>
+          <w:rFonts w:ascii="Times New Roman" w:hAnsi="Times New Roman" w:cs="Times New Roman"/>
+          <w:color w:val="1E293B"/>
+        </w:rPr>
+      </w:pPr>
+      <w:r>
+        <w:rPr>
+          <w:rFonts w:ascii="Times New Roman" w:hAnsi="Times New Roman" w:cs="Times New Roman"/>
+          <w:color w:val="1E293B"/>
+        </w:rPr>
+        <w:t xml:space="preserve">1. Query Simplification &amp; Abstraction: Client applications, REST API routes, and analytics dashboards query a single logical entity instead of authoring repetitive, multi-way JOIN clauses across five distinct tables.</w:t>
+      </w:r>
+    </w:p>
+    <w:p>
+      <w:pPr>
+        <w:jc w:val="both"/>
+        <w:ind w:left="360"/>
+        <w:spacing w:before="0" w:after="120" w:line="276" w:lineRule="auto"/>
+        <w:rPr>
+          <w:rFonts w:ascii="Times New Roman" w:hAnsi="Times New Roman" w:cs="Times New Roman"/>
+          <w:color w:val="1E293B"/>
+        </w:rPr>
+      </w:pPr>
+      <w:r>
+        <w:rPr>
+          <w:rFonts w:ascii="Times New Roman" w:hAnsi="Times New Roman" w:cs="Times New Roman"/>
+          <w:color w:val="1E293B"/>
+        </w:rPr>
+        <w:t xml:space="preserve">2. Security and Logical Data Independence: Restricts access to sensitive base table columns while presenting customized operational projections to authenticated viewers and external consumers.</w:t>
+      </w:r>
+    </w:p>
+    <w:p>
+      <w:pPr>
+        <w:jc w:val="both"/>
+        <w:ind w:left="360"/>
+        <w:spacing w:before="0" w:after="120" w:line="276" w:lineRule="auto"/>
+        <w:rPr>
+          <w:rFonts w:ascii="Times New Roman" w:hAnsi="Times New Roman" w:cs="Times New Roman"/>
+          <w:color w:val="1E293B"/>
+        </w:rPr>
+      </w:pPr>
+      <w:r>
+        <w:rPr>
+          <w:rFonts w:ascii="Times New Roman" w:hAnsi="Times New Roman" w:cs="Times New Roman"/>
+          <w:color w:val="1E293B"/>
+        </w:rPr>
+        <w:t xml:space="preserve">3. Uniformity: Centralizes relationship definitions so changes to underlying foreign keys do not invalidate application frontends.</w:t>
+      </w:r>
+    </w:p>
+    <w:p>
+      <w:pPr>
+        <w:spacing w:before="140" w:after="60" w:line="276" w:lineRule="auto"/>
+        <w:rPr>
+          <w:rFonts w:ascii="Times New Roman" w:hAnsi="Times New Roman" w:cs="Times New Roman"/>
+          <w:b/>
+          <w:bCs/>
+        </w:rPr>
+      </w:pPr>
+      <w:r>
+        <w:rPr>
+          <w:rFonts w:ascii="Times New Roman" w:hAnsi="Times New Roman" w:cs="Times New Roman"/>
+          <w:b/>
+          <w:bCs/>
+        </w:rPr>
+        <w:t xml:space="preserve">Table 3.10: Catalog of Database Views in CricketTournamentDB</w:t>
+      </w:r>
+    </w:p>
+    <w:tbl>
+      <w:tblPr>
+        <w:tblStyle w:val="TableGrid"/>
+        <w:tblW w:w="0" w:type="auto"/>
+        <w:jc w:val="center"/>
+        <w:tblBorders>
+          <w:top w:val="single" w:sz="6" w:space="0" w:color="94A3B8"/>
+          <w:left w:val="single" w:sz="6" w:space="0" w:color="94A3B8"/>
+          <w:bottom w:val="single" w:sz="6" w:space="0" w:color="94A3B8"/>
+          <w:right w:val="single" w:sz="6" w:space="0" w:color="94A3B8"/>
+          <w:insideH w:val="single" w:sz="4" w:space="0" w:color="CBD5E1"/>
+          <w:insideV w:val="single" w:sz="4" w:space="0" w:color="CBD5E1"/>
+        </w:tblBorders>
+      </w:tblPr>
+      <w:tblGrid>
+        <w:gridCol w:w="2200"/>
+        <w:gridCol w:w="2600"/>
+        <w:gridCol w:w="4200"/>
+      </w:tblGrid>
+      <w:tr>
+        <w:trPr>
+          <w:tblHeader/>
+        </w:trPr>
+        <w:tc>
+          <w:tcPr>
+            <w:tcW w:w="2200" w:type="dxa"/>
+            <w:shd w:val="clear" w:color="auto" w:fill="E2E8F0"/>
+            <w:tcMar>
+              <w:top w:w="120" w:type="dxa"/>
+              <w:bottom w:w="120" w:type="dxa"/>
+              <w:left w:w="140" w:type="dxa"/>
+              <w:right w:w="140" w:type="dxa"/>
+            </w:tcMar>
+          </w:tcPr>
+          <w:p>
+            <w:pPr>
+              <w:jc w:val="center"/>
+              <w:spacing w:before="60" w:after="60"/>
+              <w:rPr>
+                <w:rFonts w:ascii="Times New Roman" w:hAnsi="Times New Roman" w:cs="Times New Roman"/>
+                <w:b/>
+                <w:bCs/>
+                <w:sz w:val="21"/>
+                <w:szCs w:val="21"/>
+                <w:color w:val="0F172A"/>
+              </w:rPr>
+            </w:pPr>
+            <w:r>
+              <w:rPr>
+                <w:rFonts w:ascii="Times New Roman" w:hAnsi="Times New Roman" w:cs="Times New Roman"/>
+                <w:b/>
+                <w:bCs/>
+                <w:sz w:val="21"/>
+                <w:szCs w:val="21"/>
+                <w:color w:val="0F172A"/>
+              </w:rPr>
+              <w:t>View Name</w:t>
+            </w:r>
+          </w:p>
+        </w:tc>
+        <w:tc>
+          <w:tcPr>
+            <w:tcW w:w="2600" w:type="dxa"/>
+            <w:shd w:val="clear" w:color="auto" w:fill="E2E8F0"/>
+            <w:tcMar>
+              <w:top w:w="120" w:type="dxa"/>
+              <w:bottom w:w="120" w:type="dxa"/>
+              <w:left w:w="140" w:type="dxa"/>
+              <w:right w:w="140" w:type="dxa"/>
+            </w:tcMar>
+          </w:tcPr>
+          <w:p>
+            <w:pPr>
+              <w:jc w:val="center"/>
+              <w:spacing w:before="60" w:after="60"/>
+              <w:rPr>
+                <w:rFonts w:ascii="Times New Roman" w:hAnsi="Times New Roman" w:cs="Times New Roman"/>
+                <w:b/>
+                <w:bCs/>
+                <w:sz w:val="21"/>
+                <w:szCs w:val="21"/>
+                <w:color w:val="0F172A"/>
+              </w:rPr>
+            </w:pPr>
+            <w:r>
+              <w:rPr>
+                <w:rFonts w:ascii="Times New Roman" w:hAnsi="Times New Roman" w:cs="Times New Roman"/>
+                <w:b/>
+                <w:bCs/>
+                <w:sz w:val="21"/>
+                <w:szCs w:val="21"/>
+                <w:color w:val="0F172A"/>
+              </w:rPr>
+              <w:t>Base Relations Joined</w:t>
+            </w:r>
+          </w:p>
+        </w:tc>
+        <w:tc>
+          <w:tcPr>
+            <w:tcW w:w="4200" w:type="dxa"/>
+            <w:shd w:val="clear" w:color="auto" w:fill="E2E8F0"/>
+            <w:tcMar>
+              <w:top w:w="120" w:type="dxa"/>
+              <w:bottom w:w="120" w:type="dxa"/>
+              <w:left w:w="140" w:type="dxa"/>
+              <w:right w:w="140" w:type="dxa"/>
+            </w:tcMar>
+          </w:tcPr>
+          <w:p>
+            <w:pPr>
+              <w:jc w:val="center"/>
+              <w:spacing w:before="60" w:after="60"/>
+              <w:rPr>
+                <w:rFonts w:ascii="Times New Roman" w:hAnsi="Times New Roman" w:cs="Times New Roman"/>
+                <w:b/>
+                <w:bCs/>
+                <w:sz w:val="21"/>
+                <w:szCs w:val="21"/>
+                <w:color w:val="0F172A"/>
+              </w:rPr>
+            </w:pPr>
+            <w:r>
+              <w:rPr>
+                <w:rFonts w:ascii="Times New Roman" w:hAnsi="Times New Roman" w:cs="Times New Roman"/>
+                <w:b/>
+                <w:bCs/>
+                <w:sz w:val="21"/>
+                <w:szCs w:val="21"/>
+                <w:color w:val="0F172A"/>
+              </w:rPr>
+              <w:t>Purpose &amp; Encapsulated Logic</w:t>
+            </w:r>
+          </w:p>
+        </w:tc>
+      </w:tr>
+      <w:tr>
+        <w:tc>
+          <w:tcPr>
+            <w:tcW w:w="2200" w:type="dxa"/>
+            <w:shd w:val="clear" w:color="auto" w:fill="FFFFFF"/>
+            <w:tcMar>
+              <w:top w:w="80" w:type="dxa"/>
+              <w:bottom w:w="80" w:type="dxa"/>
+              <w:left w:w="120" w:type="dxa"/>
+              <w:right w:w="120" w:type="dxa"/>
+            </w:tcMar>
+          </w:tcPr>
+          <w:p>
+            <w:pPr>
+              <w:jc w:val="center"/>
+              <w:spacing w:before="40" w:after="40"/>
+              <w:rPr>
+                <w:rFonts w:ascii="Times New Roman" w:hAnsi="Times New Roman" w:cs="Times New Roman"/>
+                <w:sz w:val="20"/>
+                <w:szCs w:val="20"/>
+                <w:color w:val="1E293B"/>
+              </w:rPr>
+            </w:pPr>
+            <w:r>
+              <w:rPr>
+                <w:rFonts w:ascii="Times New Roman" w:hAnsi="Times New Roman" w:cs="Times New Roman"/>
+                <w:sz w:val="20"/>
+                <w:szCs w:val="20"/>
+                <w:color w:val="1E293B"/>
+              </w:rPr>
+              <w:t>TeamDetails</w:t>
+            </w:r>
+          </w:p>
+        </w:tc>
+        <w:tc>
+          <w:tcPr>
+            <w:tcW w:w="2600" w:type="dxa"/>
+            <w:shd w:val="clear" w:color="auto" w:fill="FFFFFF"/>
+            <w:tcMar>
+              <w:top w:w="80" w:type="dxa"/>
+              <w:bottom w:w="80" w:type="dxa"/>
+              <w:left w:w="120" w:type="dxa"/>
+              <w:right w:w="120" w:type="dxa"/>
+            </w:tcMar>
+          </w:tcPr>
+          <w:p>
+            <w:pPr>
+              <w:jc w:val="center"/>
+              <w:spacing w:before="40" w:after="40"/>
+              <w:rPr>
+                <w:rFonts w:ascii="Times New Roman" w:hAnsi="Times New Roman" w:cs="Times New Roman"/>
+                <w:sz w:val="20"/>
+                <w:szCs w:val="20"/>
+                <w:color w:val="1E293B"/>
+              </w:rPr>
+            </w:pPr>
+            <w:r>
+              <w:rPr>
+                <w:rFonts w:ascii="Times New Roman" w:hAnsi="Times New Roman" w:cs="Times New Roman"/>
+                <w:sz w:val="20"/>
+                <w:szCs w:val="20"/>
+                <w:color w:val="1E293B"/>
+              </w:rPr>
+              <w:t>CricketTeam</w:t>
+            </w:r>
+          </w:p>
+        </w:tc>
+        <w:tc>
+          <w:tcPr>
+            <w:tcW w:w="4200" w:type="dxa"/>
+            <w:shd w:val="clear" w:color="auto" w:fill="FFFFFF"/>
+            <w:tcMar>
+              <w:top w:w="80" w:type="dxa"/>
+              <w:bottom w:w="80" w:type="dxa"/>
+              <w:left w:w="120" w:type="dxa"/>
+              <w:right w:w="120" w:type="dxa"/>
+            </w:tcMar>
+          </w:tcPr>
+          <w:p>
+            <w:pPr>
+              <w:jc w:val="center"/>
+              <w:spacing w:before="40" w:after="40"/>
+              <w:rPr>
+                <w:rFonts w:ascii="Times New Roman" w:hAnsi="Times New Roman" w:cs="Times New Roman"/>
+                <w:sz w:val="20"/>
+                <w:szCs w:val="20"/>
+                <w:color w:val="1E293B"/>
+              </w:rPr>
+            </w:pPr>
+            <w:r>
+              <w:rPr>
+                <w:rFonts w:ascii="Times New Roman" w:hAnsi="Times New Roman" w:cs="Times New Roman"/>
+                <w:sz w:val="20"/>
+                <w:szCs w:val="20"/>
+                <w:color w:val="1E293B"/>
+              </w:rPr>
+              <w:t>Encapsulates franchise metadata including Head Coach, Home Venue, and Corporate Owner.</w:t>
+            </w:r>
+          </w:p>
+        </w:tc>
+      </w:tr>
+      <w:tr>
+        <w:tc>
+          <w:tcPr>
+            <w:tcW w:w="2200" w:type="dxa"/>
+            <w:shd w:val="clear" w:color="auto" w:fill="F8FAFC"/>
+            <w:tcMar>
+              <w:top w:w="80" w:type="dxa"/>
+              <w:bottom w:w="80" w:type="dxa"/>
+              <w:left w:w="120" w:type="dxa"/>
+              <w:right w:w="120" w:type="dxa"/>
+            </w:tcMar>
+          </w:tcPr>
+          <w:p>
+            <w:pPr>
+              <w:jc w:val="center"/>
+              <w:spacing w:before="40" w:after="40"/>
+              <w:rPr>
+                <w:rFonts w:ascii="Times New Roman" w:hAnsi="Times New Roman" w:cs="Times New Roman"/>
+                <w:sz w:val="20"/>
+                <w:szCs w:val="20"/>
+                <w:color w:val="1E293B"/>
+              </w:rPr>
+            </w:pPr>
+            <w:r>
+              <w:rPr>
+                <w:rFonts w:ascii="Times New Roman" w:hAnsi="Times New Roman" w:cs="Times New Roman"/>
+                <w:sz w:val="20"/>
+                <w:szCs w:val="20"/>
+                <w:color w:val="1E293B"/>
+              </w:rPr>
+              <w:t>PlayerDetails</w:t>
+            </w:r>
+          </w:p>
+        </w:tc>
+        <w:tc>
+          <w:tcPr>
+            <w:tcW w:w="2600" w:type="dxa"/>
+            <w:shd w:val="clear" w:color="auto" w:fill="F8FAFC"/>
+            <w:tcMar>
+              <w:top w:w="80" w:type="dxa"/>
+              <w:bottom w:w="80" w:type="dxa"/>
+              <w:left w:w="120" w:type="dxa"/>
+              <w:right w:w="120" w:type="dxa"/>
+            </w:tcMar>
+          </w:tcPr>
+          <w:p>
+            <w:pPr>
+              <w:jc w:val="center"/>
+              <w:spacing w:before="40" w:after="40"/>
+              <w:rPr>
+                <w:rFonts w:ascii="Times New Roman" w:hAnsi="Times New Roman" w:cs="Times New Roman"/>
+                <w:sz w:val="20"/>
+                <w:szCs w:val="20"/>
+                <w:color w:val="1E293B"/>
+              </w:rPr>
+            </w:pPr>
+            <w:r>
+              <w:rPr>
+                <w:rFonts w:ascii="Times New Roman" w:hAnsi="Times New Roman" w:cs="Times New Roman"/>
+                <w:sz w:val="20"/>
+                <w:szCs w:val="20"/>
+                <w:color w:val="1E293B"/>
+              </w:rPr>
+              <w:t>CricketPlayer, CricketTeam</w:t>
+            </w:r>
+          </w:p>
+        </w:tc>
+        <w:tc>
+          <w:tcPr>
+            <w:tcW w:w="4200" w:type="dxa"/>
+            <w:shd w:val="clear" w:color="auto" w:fill="F8FAFC"/>
+            <w:tcMar>
+              <w:top w:w="80" w:type="dxa"/>
+              <w:bottom w:w="80" w:type="dxa"/>
+              <w:left w:w="120" w:type="dxa"/>
+              <w:right w:w="120" w:type="dxa"/>
+            </w:tcMar>
+          </w:tcPr>
+          <w:p>
+            <w:pPr>
+              <w:jc w:val="center"/>
+              <w:spacing w:before="40" w:after="40"/>
+              <w:rPr>
+                <w:rFonts w:ascii="Times New Roman" w:hAnsi="Times New Roman" w:cs="Times New Roman"/>
+                <w:sz w:val="20"/>
+                <w:szCs w:val="20"/>
+                <w:color w:val="1E293B"/>
+              </w:rPr>
+            </w:pPr>
+            <w:r>
+              <w:rPr>
+                <w:rFonts w:ascii="Times New Roman" w:hAnsi="Times New Roman" w:cs="Times New Roman"/>
+                <w:sz w:val="20"/>
+                <w:szCs w:val="20"/>
+                <w:color w:val="1E293B"/>
+              </w:rPr>
+              <w:t>Performs LEFT JOIN to pair player biographical profiles with human-readable Team names.</w:t>
+            </w:r>
+          </w:p>
+        </w:tc>
+      </w:tr>
+      <w:tr>
+        <w:tc>
+          <w:tcPr>
+            <w:tcW w:w="2200" w:type="dxa"/>
+            <w:shd w:val="clear" w:color="auto" w:fill="FFFFFF"/>
+            <w:tcMar>
+              <w:top w:w="80" w:type="dxa"/>
+              <w:bottom w:w="80" w:type="dxa"/>
+              <w:left w:w="120" w:type="dxa"/>
+              <w:right w:w="120" w:type="dxa"/>
+            </w:tcMar>
+          </w:tcPr>
+          <w:p>
+            <w:pPr>
+              <w:jc w:val="center"/>
+              <w:spacing w:before="40" w:after="40"/>
+              <w:rPr>
+                <w:rFonts w:ascii="Times New Roman" w:hAnsi="Times New Roman" w:cs="Times New Roman"/>
+                <w:sz w:val="20"/>
+                <w:szCs w:val="20"/>
+                <w:color w:val="1E293B"/>
+              </w:rPr>
+            </w:pPr>
+            <w:r>
+              <w:rPr>
+                <w:rFonts w:ascii="Times New Roman" w:hAnsi="Times New Roman" w:cs="Times New Roman"/>
+                <w:sz w:val="20"/>
+                <w:szCs w:val="20"/>
+                <w:color w:val="1E293B"/>
+              </w:rPr>
+              <w:t>MatchDetails</w:t>
+            </w:r>
+          </w:p>
+        </w:tc>
+        <w:tc>
+          <w:tcPr>
+            <w:tcW w:w="2600" w:type="dxa"/>
+            <w:shd w:val="clear" w:color="auto" w:fill="FFFFFF"/>
+            <w:tcMar>
+              <w:top w:w="80" w:type="dxa"/>
+              <w:bottom w:w="80" w:type="dxa"/>
+              <w:left w:w="120" w:type="dxa"/>
+              <w:right w:w="120" w:type="dxa"/>
+            </w:tcMar>
+          </w:tcPr>
+          <w:p>
+            <w:pPr>
+              <w:jc w:val="center"/>
+              <w:spacing w:before="40" w:after="40"/>
+              <w:rPr>
+                <w:rFonts w:ascii="Times New Roman" w:hAnsi="Times New Roman" w:cs="Times New Roman"/>
+                <w:sz w:val="20"/>
+                <w:szCs w:val="20"/>
+                <w:color w:val="1E293B"/>
+              </w:rPr>
+            </w:pPr>
+            <w:r>
+              <w:rPr>
+                <w:rFonts w:ascii="Times New Roman" w:hAnsi="Times New Roman" w:cs="Times New Roman"/>
+                <w:sz w:val="20"/>
+                <w:szCs w:val="20"/>
+                <w:color w:val="1E293B"/>
+              </w:rPr>
+              <w:t>TournamentMatch, CricketStadium</w:t>
+            </w:r>
+          </w:p>
+        </w:tc>
+        <w:tc>
+          <w:tcPr>
+            <w:tcW w:w="4200" w:type="dxa"/>
+            <w:shd w:val="clear" w:color="auto" w:fill="FFFFFF"/>
+            <w:tcMar>
+              <w:top w:w="80" w:type="dxa"/>
+              <w:bottom w:w="80" w:type="dxa"/>
+              <w:left w:w="120" w:type="dxa"/>
+              <w:right w:w="120" w:type="dxa"/>
+            </w:tcMar>
+          </w:tcPr>
+          <w:p>
+            <w:pPr>
+              <w:jc w:val="center"/>
+              <w:spacing w:before="40" w:after="40"/>
+              <w:rPr>
+                <w:rFonts w:ascii="Times New Roman" w:hAnsi="Times New Roman" w:cs="Times New Roman"/>
+                <w:sz w:val="20"/>
+                <w:szCs w:val="20"/>
+                <w:color w:val="1E293B"/>
+              </w:rPr>
+            </w:pPr>
+            <w:r>
+              <w:rPr>
+                <w:rFonts w:ascii="Times New Roman" w:hAnsi="Times New Roman" w:cs="Times New Roman"/>
+                <w:sz w:val="20"/>
+                <w:szCs w:val="20"/>
+                <w:color w:val="1E293B"/>
+              </w:rPr>
+              <w:t>Resolves match schedules and fixtures with physical Stadium names and host City locations.</w:t>
+            </w:r>
+          </w:p>
+        </w:tc>
+      </w:tr>
+      <w:tr>
+        <w:tc>
+          <w:tcPr>
+            <w:tcW w:w="2200" w:type="dxa"/>
+            <w:shd w:val="clear" w:color="auto" w:fill="F8FAFC"/>
+            <w:tcMar>
+              <w:top w:w="80" w:type="dxa"/>
+              <w:bottom w:w="80" w:type="dxa"/>
+              <w:left w:w="120" w:type="dxa"/>
+              <w:right w:w="120" w:type="dxa"/>
+            </w:tcMar>
+          </w:tcPr>
+          <w:p>
+            <w:pPr>
+              <w:jc w:val="center"/>
+              <w:spacing w:before="40" w:after="40"/>
+              <w:rPr>
+                <w:rFonts w:ascii="Times New Roman" w:hAnsi="Times New Roman" w:cs="Times New Roman"/>
+                <w:sz w:val="20"/>
+                <w:szCs w:val="20"/>
+                <w:color w:val="1E293B"/>
+              </w:rPr>
+            </w:pPr>
+            <w:r>
+              <w:rPr>
+                <w:rFonts w:ascii="Times New Roman" w:hAnsi="Times New Roman" w:cs="Times New Roman"/>
+                <w:sz w:val="20"/>
+                <w:szCs w:val="20"/>
+                <w:color w:val="1E293B"/>
+              </w:rPr>
+              <w:t>TeamSponsorDetails</w:t>
+            </w:r>
+          </w:p>
+        </w:tc>
+        <w:tc>
+          <w:tcPr>
+            <w:tcW w:w="2600" w:type="dxa"/>
+            <w:shd w:val="clear" w:color="auto" w:fill="F8FAFC"/>
+            <w:tcMar>
+              <w:top w:w="80" w:type="dxa"/>
+              <w:bottom w:w="80" w:type="dxa"/>
+              <w:left w:w="120" w:type="dxa"/>
+              <w:right w:w="120" w:type="dxa"/>
+            </w:tcMar>
+          </w:tcPr>
+          <w:p>
+            <w:pPr>
+              <w:jc w:val="center"/>
+              <w:spacing w:before="40" w:after="40"/>
+              <w:rPr>
+                <w:rFonts w:ascii="Times New Roman" w:hAnsi="Times New Roman" w:cs="Times New Roman"/>
+                <w:sz w:val="20"/>
+                <w:szCs w:val="20"/>
+                <w:color w:val="1E293B"/>
+              </w:rPr>
+            </w:pPr>
+            <w:r>
+              <w:rPr>
+                <w:rFonts w:ascii="Times New Roman" w:hAnsi="Times New Roman" w:cs="Times New Roman"/>
+                <w:sz w:val="20"/>
+                <w:szCs w:val="20"/>
+                <w:color w:val="1E293B"/>
+              </w:rPr>
+              <w:t>TeamSponsor, CricketTeam</w:t>
+            </w:r>
+          </w:p>
+        </w:tc>
+        <w:tc>
+          <w:tcPr>
+            <w:tcW w:w="4200" w:type="dxa"/>
+            <w:shd w:val="clear" w:color="auto" w:fill="F8FAFC"/>
+            <w:tcMar>
+              <w:top w:w="80" w:type="dxa"/>
+              <w:bottom w:w="80" w:type="dxa"/>
+              <w:left w:w="120" w:type="dxa"/>
+              <w:right w:w="120" w:type="dxa"/>
+            </w:tcMar>
+          </w:tcPr>
+          <w:p>
+            <w:pPr>
+              <w:jc w:val="center"/>
+              <w:spacing w:before="40" w:after="40"/>
+              <w:rPr>
+                <w:rFonts w:ascii="Times New Roman" w:hAnsi="Times New Roman" w:cs="Times New Roman"/>
+                <w:sz w:val="20"/>
+                <w:szCs w:val="20"/>
+                <w:color w:val="1E293B"/>
+              </w:rPr>
+            </w:pPr>
+            <w:r>
+              <w:rPr>
+                <w:rFonts w:ascii="Times New Roman" w:hAnsi="Times New Roman" w:cs="Times New Roman"/>
+                <w:sz w:val="20"/>
+                <w:szCs w:val="20"/>
+                <w:color w:val="1E293B"/>
+              </w:rPr>
+              <w:t>Pairs corporate sponsor brands, commercial valuations, and industry types with sponsored Teams.</w:t>
+            </w:r>
+          </w:p>
+        </w:tc>
+      </w:tr>
+      <w:tr>
+        <w:tc>
+          <w:tcPr>
+            <w:tcW w:w="2200" w:type="dxa"/>
+            <w:shd w:val="clear" w:color="auto" w:fill="FFFFFF"/>
+            <w:tcMar>
+              <w:top w:w="80" w:type="dxa"/>
+              <w:bottom w:w="80" w:type="dxa"/>
+              <w:left w:w="120" w:type="dxa"/>
+              <w:right w:w="120" w:type="dxa"/>
+            </w:tcMar>
+          </w:tcPr>
+          <w:p>
+            <w:pPr>
+              <w:jc w:val="center"/>
+              <w:spacing w:before="40" w:after="40"/>
+              <w:rPr>
+                <w:rFonts w:ascii="Times New Roman" w:hAnsi="Times New Roman" w:cs="Times New Roman"/>
+                <w:sz w:val="20"/>
+                <w:szCs w:val="20"/>
+                <w:color w:val="1E293B"/>
+              </w:rPr>
+            </w:pPr>
+            <w:r>
+              <w:rPr>
+                <w:rFonts w:ascii="Times New Roman" w:hAnsi="Times New Roman" w:cs="Times New Roman"/>
+                <w:sz w:val="20"/>
+                <w:szCs w:val="20"/>
+                <w:color w:val="1E293B"/>
+              </w:rPr>
+              <w:t>MatchScorecardDetails</w:t>
+            </w:r>
+          </w:p>
+        </w:tc>
+        <w:tc>
+          <w:tcPr>
+            <w:tcW w:w="2600" w:type="dxa"/>
+            <w:shd w:val="clear" w:color="auto" w:fill="FFFFFF"/>
+            <w:tcMar>
+              <w:top w:w="80" w:type="dxa"/>
+              <w:bottom w:w="80" w:type="dxa"/>
+              <w:left w:w="120" w:type="dxa"/>
+              <w:right w:w="120" w:type="dxa"/>
+            </w:tcMar>
+          </w:tcPr>
+          <w:p>
+            <w:pPr>
+              <w:jc w:val="center"/>
+              <w:spacing w:before="40" w:after="40"/>
+              <w:rPr>
+                <w:rFonts w:ascii="Times New Roman" w:hAnsi="Times New Roman" w:cs="Times New Roman"/>
+                <w:sz w:val="20"/>
+                <w:szCs w:val="20"/>
+                <w:color w:val="1E293B"/>
+              </w:rPr>
+            </w:pPr>
+            <w:r>
+              <w:rPr>
+                <w:rFonts w:ascii="Times New Roman" w:hAnsi="Times New Roman" w:cs="Times New Roman"/>
+                <w:sz w:val="20"/>
+                <w:szCs w:val="20"/>
+                <w:color w:val="1E293B"/>
+              </w:rPr>
+              <w:t>MatchScorecard, CricketPlayer, CricketTeam, TournamentMatch</w:t>
+            </w:r>
+          </w:p>
+        </w:tc>
+        <w:tc>
+          <w:tcPr>
+            <w:tcW w:w="4200" w:type="dxa"/>
+            <w:shd w:val="clear" w:color="auto" w:fill="FFFFFF"/>
+            <w:tcMar>
+              <w:top w:w="80" w:type="dxa"/>
+              <w:bottom w:w="80" w:type="dxa"/>
+              <w:left w:w="120" w:type="dxa"/>
+              <w:right w:w="120" w:type="dxa"/>
+            </w:tcMar>
+          </w:tcPr>
+          <w:p>
+            <w:pPr>
+              <w:jc w:val="center"/>
+              <w:spacing w:before="40" w:after="40"/>
+              <w:rPr>
+                <w:rFonts w:ascii="Times New Roman" w:hAnsi="Times New Roman" w:cs="Times New Roman"/>
+                <w:sz w:val="20"/>
+                <w:szCs w:val="20"/>
+                <w:color w:val="1E293B"/>
+              </w:rPr>
+            </w:pPr>
+            <w:r>
+              <w:rPr>
+                <w:rFonts w:ascii="Times New Roman" w:hAnsi="Times New Roman" w:cs="Times New Roman"/>
+                <w:sz w:val="20"/>
+                <w:szCs w:val="20"/>
+                <w:color w:val="1E293B"/>
+              </w:rPr>
+              <w:t>Multi-table JOIN connecting player names, team affiliations, match dates, runs scored, balls, and wickets.</w:t>
+            </w:r>
+          </w:p>
+        </w:tc>
+      </w:tr>
+      <w:tr>
+        <w:tc>
+          <w:tcPr>
+            <w:tcW w:w="2200" w:type="dxa"/>
+            <w:shd w:val="clear" w:color="auto" w:fill="F8FAFC"/>
+            <w:tcMar>
+              <w:top w:w="80" w:type="dxa"/>
+              <w:bottom w:w="80" w:type="dxa"/>
+              <w:left w:w="120" w:type="dxa"/>
+              <w:right w:w="120" w:type="dxa"/>
+            </w:tcMar>
+          </w:tcPr>
+          <w:p>
+            <w:pPr>
+              <w:jc w:val="center"/>
+              <w:spacing w:before="40" w:after="40"/>
+              <w:rPr>
+                <w:rFonts w:ascii="Times New Roman" w:hAnsi="Times New Roman" w:cs="Times New Roman"/>
+                <w:sz w:val="20"/>
+                <w:szCs w:val="20"/>
+                <w:color w:val="1E293B"/>
+              </w:rPr>
+            </w:pPr>
+            <w:r>
+              <w:rPr>
+                <w:rFonts w:ascii="Times New Roman" w:hAnsi="Times New Roman" w:cs="Times New Roman"/>
+                <w:sz w:val="20"/>
+                <w:szCs w:val="20"/>
+                <w:color w:val="1E293B"/>
+              </w:rPr>
+              <w:t>TeamMatchParticipation</w:t>
+            </w:r>
+          </w:p>
+        </w:tc>
+        <w:tc>
+          <w:tcPr>
+            <w:tcW w:w="2600" w:type="dxa"/>
+            <w:shd w:val="clear" w:color="auto" w:fill="F8FAFC"/>
+            <w:tcMar>
+              <w:top w:w="80" w:type="dxa"/>
+              <w:bottom w:w="80" w:type="dxa"/>
+              <w:left w:w="120" w:type="dxa"/>
+              <w:right w:w="120" w:type="dxa"/>
+            </w:tcMar>
+          </w:tcPr>
+          <w:p>
+            <w:pPr>
+              <w:jc w:val="center"/>
+              <w:spacing w:before="40" w:after="40"/>
+              <w:rPr>
+                <w:rFonts w:ascii="Times New Roman" w:hAnsi="Times New Roman" w:cs="Times New Roman"/>
+                <w:sz w:val="20"/>
+                <w:szCs w:val="20"/>
+                <w:color w:val="1E293B"/>
+              </w:rPr>
+            </w:pPr>
+            <w:r>
+              <w:rPr>
+                <w:rFonts w:ascii="Times New Roman" w:hAnsi="Times New Roman" w:cs="Times New Roman"/>
+                <w:sz w:val="20"/>
+                <w:szCs w:val="20"/>
+                <w:color w:val="1E293B"/>
+              </w:rPr>
+              <w:t>TeamParticipation, CricketTeam, TournamentMatch</w:t>
+            </w:r>
+          </w:p>
+        </w:tc>
+        <w:tc>
+          <w:tcPr>
+            <w:tcW w:w="4200" w:type="dxa"/>
+            <w:shd w:val="clear" w:color="auto" w:fill="F8FAFC"/>
+            <w:tcMar>
+              <w:top w:w="80" w:type="dxa"/>
+              <w:bottom w:w="80" w:type="dxa"/>
+              <w:left w:w="120" w:type="dxa"/>
+              <w:right w:w="120" w:type="dxa"/>
+            </w:tcMar>
+          </w:tcPr>
+          <w:p>
+            <w:pPr>
+              <w:jc w:val="center"/>
+              <w:spacing w:before="40" w:after="40"/>
+              <w:rPr>
+                <w:rFonts w:ascii="Times New Roman" w:hAnsi="Times New Roman" w:cs="Times New Roman"/>
+                <w:sz w:val="20"/>
+                <w:szCs w:val="20"/>
+                <w:color w:val="1E293B"/>
+              </w:rPr>
+            </w:pPr>
+            <w:r>
+              <w:rPr>
+                <w:rFonts w:ascii="Times New Roman" w:hAnsi="Times New Roman" w:cs="Times New Roman"/>
+                <w:sz w:val="20"/>
+                <w:szCs w:val="20"/>
+                <w:color w:val="1E293B"/>
+              </w:rPr>
+              <w:t>Consolidates fixture participation records with team names, match dates, formats, and results.</w:t>
+            </w:r>
+          </w:p>
+        </w:tc>
+      </w:tr>
+      <w:tr>
+        <w:tc>
+          <w:tcPr>
+            <w:tcW w:w="2200" w:type="dxa"/>
+            <w:shd w:val="clear" w:color="auto" w:fill="FFFFFF"/>
+            <w:tcMar>
+              <w:top w:w="80" w:type="dxa"/>
+              <w:bottom w:w="80" w:type="dxa"/>
+              <w:left w:w="120" w:type="dxa"/>
+              <w:right w:w="120" w:type="dxa"/>
+            </w:tcMar>
+          </w:tcPr>
+          <w:p>
+            <w:pPr>
+              <w:jc w:val="center"/>
+              <w:spacing w:before="40" w:after="40"/>
+              <w:rPr>
+                <w:rFonts w:ascii="Times New Roman" w:hAnsi="Times New Roman" w:cs="Times New Roman"/>
+                <w:sz w:val="20"/>
+                <w:szCs w:val="20"/>
+                <w:color w:val="1E293B"/>
+              </w:rPr>
+            </w:pPr>
+            <w:r>
+              <w:rPr>
+                <w:rFonts w:ascii="Times New Roman" w:hAnsi="Times New Roman" w:cs="Times New Roman"/>
+                <w:sz w:val="20"/>
+                <w:szCs w:val="20"/>
+                <w:color w:val="1E293B"/>
+              </w:rPr>
+              <w:t>MatchOfficialsDetails</w:t>
+            </w:r>
+          </w:p>
+        </w:tc>
+        <w:tc>
+          <w:tcPr>
+            <w:tcW w:w="2600" w:type="dxa"/>
+            <w:shd w:val="clear" w:color="auto" w:fill="FFFFFF"/>
+            <w:tcMar>
+              <w:top w:w="80" w:type="dxa"/>
+              <w:bottom w:w="80" w:type="dxa"/>
+              <w:left w:w="120" w:type="dxa"/>
+              <w:right w:w="120" w:type="dxa"/>
+            </w:tcMar>
+          </w:tcPr>
+          <w:p>
+            <w:pPr>
+              <w:jc w:val="center"/>
+              <w:spacing w:before="40" w:after="40"/>
+              <w:rPr>
+                <w:rFonts w:ascii="Times New Roman" w:hAnsi="Times New Roman" w:cs="Times New Roman"/>
+                <w:sz w:val="20"/>
+                <w:szCs w:val="20"/>
+                <w:color w:val="1E293B"/>
+              </w:rPr>
+            </w:pPr>
+            <w:r>
+              <w:rPr>
+                <w:rFonts w:ascii="Times New Roman" w:hAnsi="Times New Roman" w:cs="Times New Roman"/>
+                <w:sz w:val="20"/>
+                <w:szCs w:val="20"/>
+                <w:color w:val="1E293B"/>
+              </w:rPr>
+              <w:t>MatchOfficials, TournamentMatch, CricketUmpire</w:t>
+            </w:r>
+          </w:p>
+        </w:tc>
+        <w:tc>
+          <w:tcPr>
+            <w:tcW w:w="4200" w:type="dxa"/>
+            <w:shd w:val="clear" w:color="auto" w:fill="FFFFFF"/>
+            <w:tcMar>
+              <w:top w:w="80" w:type="dxa"/>
+              <w:bottom w:w="80" w:type="dxa"/>
+              <w:left w:w="120" w:type="dxa"/>
+              <w:right w:w="120" w:type="dxa"/>
+            </w:tcMar>
+          </w:tcPr>
+          <w:p>
+            <w:pPr>
+              <w:jc w:val="center"/>
+              <w:spacing w:before="40" w:after="40"/>
+              <w:rPr>
+                <w:rFonts w:ascii="Times New Roman" w:hAnsi="Times New Roman" w:cs="Times New Roman"/>
+                <w:sz w:val="20"/>
+                <w:szCs w:val="20"/>
+                <w:color w:val="1E293B"/>
+              </w:rPr>
+            </w:pPr>
+            <w:r>
+              <w:rPr>
+                <w:rFonts w:ascii="Times New Roman" w:hAnsi="Times New Roman" w:cs="Times New Roman"/>
+                <w:sz w:val="20"/>
+                <w:szCs w:val="20"/>
+                <w:color w:val="1E293B"/>
+              </w:rPr>
+              <w:t>Pairs match fixtures with accredited umpires, nationality, and certified professional experience.</w:t>
+            </w:r>
+          </w:p>
+        </w:tc>
+      </w:tr>
+    </w:tbl>
+    <w:p>
+      <w:pPr>
+        <w:spacing w:before="140" w:after="60" w:line="276" w:lineRule="auto"/>
+        <w:rPr>
+          <w:rFonts w:ascii="Times New Roman" w:hAnsi="Times New Roman" w:cs="Times New Roman"/>
+          <w:b/>
+          <w:bCs/>
+        </w:rPr>
+      </w:pPr>
+      <w:r>
+        <w:rPr>
+          <w:rFonts w:ascii="Times New Roman" w:hAnsi="Times New Roman" w:cs="Times New Roman"/>
+          <w:b/>
+          <w:bCs/>
+        </w:rPr>
+        <w:t xml:space="preserve">Listing 3.1: DDL Sample for Database Views</w:t>
+      </w:r>
+    </w:p>
+    <w:p>
+      <w:pPr>
+        <w:ind w:left="360"/>
+        <w:spacing w:before="0" w:after="30" w:line="276" w:lineRule="auto"/>
+        <w:rPr>
+          <w:rFonts w:ascii="Times New Roman" w:hAnsi="Times New Roman" w:cs="Times New Roman"/>
+          <w:i/>
+          <w:iCs/>
+          <w:sz w:val="20"/>
+          <w:szCs w:val="20"/>
+        </w:rPr>
+      </w:pPr>
+      <w:r>
+        <w:rPr>
+          <w:rFonts w:ascii="Times New Roman" w:hAnsi="Times New Roman" w:cs="Times New Roman"/>
+          <w:i/>
+          <w:iCs/>
+          <w:sz w:val="20"/>
+          <w:szCs w:val="20"/>
+        </w:rPr>
+        <w:t xml:space="preserve">CREATE OR REPLACE VIEW MatchScorecardDetails AS</w:t>
+      </w:r>
+    </w:p>
+    <w:p>
+      <w:pPr>
+        <w:ind w:left="360"/>
+        <w:spacing w:before="0" w:after="30" w:line="276" w:lineRule="auto"/>
+        <w:rPr>
+          <w:rFonts w:ascii="Times New Roman" w:hAnsi="Times New Roman" w:cs="Times New Roman"/>
+          <w:i/>
+          <w:iCs/>
+          <w:sz w:val="20"/>
+          <w:szCs w:val="20"/>
+        </w:rPr>
+      </w:pPr>
+      <w:r>
+        <w:rPr>
+          <w:rFonts w:ascii="Times New Roman" w:hAnsi="Times New Roman" w:cs="Times New Roman"/>
+          <w:i/>
+          <w:iCs/>
+          <w:sz w:val="20"/>
+          <w:szCs w:val="20"/>
+        </w:rPr>
+        <w:t xml:space="preserve">SELECT sc.ScorecardID, p.PlayerName, t.TeamName, m.MatchID, m.MatchDate, sc.Runs, sc.BallsFaced, sc.Wickets, sc.Overs</w:t>
+      </w:r>
+    </w:p>
+    <w:p>
+      <w:pPr>
+        <w:ind w:left="360"/>
+        <w:spacing w:before="0" w:after="30" w:line="276" w:lineRule="auto"/>
+        <w:rPr>
+          <w:rFonts w:ascii="Times New Roman" w:hAnsi="Times New Roman" w:cs="Times New Roman"/>
+          <w:i/>
+          <w:iCs/>
+          <w:sz w:val="20"/>
+          <w:szCs w:val="20"/>
+        </w:rPr>
+      </w:pPr>
+      <w:r>
+        <w:rPr>
+          <w:rFonts w:ascii="Times New Roman" w:hAnsi="Times New Roman" w:cs="Times New Roman"/>
+          <w:i/>
+          <w:iCs/>
+          <w:sz w:val="20"/>
+          <w:szCs w:val="20"/>
+        </w:rPr>
+        <w:t xml:space="preserve">FROM MatchScorecard sc</w:t>
+      </w:r>
+    </w:p>
+    <w:p>
+      <w:pPr>
+        <w:ind w:left="360"/>
+        <w:spacing w:before="0" w:after="30" w:line="276" w:lineRule="auto"/>
+        <w:rPr>
+          <w:rFonts w:ascii="Times New Roman" w:hAnsi="Times New Roman" w:cs="Times New Roman"/>
+          <w:i/>
+          <w:iCs/>
+          <w:sz w:val="20"/>
+          <w:szCs w:val="20"/>
+        </w:rPr>
+      </w:pPr>
+      <w:r>
+        <w:rPr>
+          <w:rFonts w:ascii="Times New Roman" w:hAnsi="Times New Roman" w:cs="Times New Roman"/>
+          <w:i/>
+          <w:iCs/>
+          <w:sz w:val="20"/>
+          <w:szCs w:val="20"/>
+        </w:rPr>
+        <w:t xml:space="preserve">JOIN CricketPlayer p ON sc.PlayerID = p.PlayerID</w:t>
+      </w:r>
+    </w:p>
+    <w:p>
+      <w:pPr>
+        <w:ind w:left="360"/>
+        <w:spacing w:before="0" w:after="30" w:line="276" w:lineRule="auto"/>
+        <w:rPr>
+          <w:rFonts w:ascii="Times New Roman" w:hAnsi="Times New Roman" w:cs="Times New Roman"/>
+          <w:i/>
+          <w:iCs/>
+          <w:sz w:val="20"/>
+          <w:szCs w:val="20"/>
+        </w:rPr>
+      </w:pPr>
+      <w:r>
+        <w:rPr>
+          <w:rFonts w:ascii="Times New Roman" w:hAnsi="Times New Roman" w:cs="Times New Roman"/>
+          <w:i/>
+          <w:iCs/>
+          <w:sz w:val="20"/>
+          <w:szCs w:val="20"/>
+        </w:rPr>
+        <w:t xml:space="preserve">LEFT JOIN CricketTeam t ON p.TeamID = t.TeamID</w:t>
+      </w:r>
+    </w:p>
+    <w:p>
+      <w:pPr>
+        <w:ind w:left="360"/>
+        <w:spacing w:before="0" w:after="120" w:line="276" w:lineRule="auto"/>
+        <w:rPr>
+          <w:rFonts w:ascii="Times New Roman" w:hAnsi="Times New Roman" w:cs="Times New Roman"/>
+          <w:i/>
+          <w:iCs/>
+          <w:sz w:val="20"/>
+          <w:szCs w:val="20"/>
+        </w:rPr>
+      </w:pPr>
+      <w:r>
+        <w:rPr>
+          <w:rFonts w:ascii="Times New Roman" w:hAnsi="Times New Roman" w:cs="Times New Roman"/>
+          <w:i/>
+          <w:iCs/>
+          <w:sz w:val="20"/>
+          <w:szCs w:val="20"/>
+        </w:rPr>
+        <w:t xml:space="preserve">JOIN TournamentMatch m ON sc.MatchID = m.MatchID;</w:t>
+      </w:r>
+    </w:p>
+    <w:p>
       <w:r>
         <w:br w:type="page"/>
       </w:r>
@@ -12257,7 +13436,7 @@
           <wp:inline distT="0" distB="0" distL="0" distR="0">
             <wp:extent cx="5486400" cy="3321620"/>
             <wp:effectExtent l="0" t="0" r="0" b="0"/>
-            <wp:docPr id="41130903" name="MySQL Tables"/>
+            <wp:docPr id="66733885" name="MySQL Tables"/>
             <wp:cNvGraphicFramePr>
               <a:graphicFrameLocks xmlns:a="http://schemas.openxmlformats.org/drawingml/2006/main" noChangeAspect="1"/>
             </wp:cNvGraphicFramePr>
@@ -12325,7 +13504,7 @@
           <wp:inline distT="0" distB="0" distL="0" distR="0">
             <wp:extent cx="5486400" cy="3868340"/>
             <wp:effectExtent l="0" t="0" r="0" b="0"/>
-            <wp:docPr id="78810342" name="MySQL Describe"/>
+            <wp:docPr id="55038939" name="MySQL Describe"/>
             <wp:cNvGraphicFramePr>
               <a:graphicFrameLocks xmlns:a="http://schemas.openxmlformats.org/drawingml/2006/main" noChangeAspect="1"/>
             </wp:cNvGraphicFramePr>
@@ -12434,7 +13613,7 @@
           <wp:inline distT="0" distB="0" distL="0" distR="0">
             <wp:extent cx="5486400" cy="3118246"/>
             <wp:effectExtent l="0" t="0" r="0" b="0"/>
-            <wp:docPr id="6479426" name="Dashboard"/>
+            <wp:docPr id="13613712" name="Dashboard"/>
             <wp:cNvGraphicFramePr>
               <a:graphicFrameLocks xmlns:a="http://schemas.openxmlformats.org/drawingml/2006/main" noChangeAspect="1"/>
             </wp:cNvGraphicFramePr>
@@ -12543,7 +13722,7 @@
           <wp:inline distT="0" distB="0" distL="0" distR="0">
             <wp:extent cx="5486400" cy="3080742"/>
             <wp:effectExtent l="0" t="0" r="0" b="0"/>
-            <wp:docPr id="88671582" name="Teams Roster"/>
+            <wp:docPr id="81990788" name="Teams Roster"/>
             <wp:cNvGraphicFramePr>
               <a:graphicFrameLocks xmlns:a="http://schemas.openxmlformats.org/drawingml/2006/main" noChangeAspect="1"/>
             </wp:cNvGraphicFramePr>
@@ -12652,7 +13831,7 @@
           <wp:inline distT="0" distB="0" distL="0" distR="0">
             <wp:extent cx="5486400" cy="3107531"/>
             <wp:effectExtent l="0" t="0" r="0" b="0"/>
-            <wp:docPr id="21552273" name="Players Roster"/>
+            <wp:docPr id="4664392" name="Players Roster"/>
             <wp:cNvGraphicFramePr>
               <a:graphicFrameLocks xmlns:a="http://schemas.openxmlformats.org/drawingml/2006/main" noChangeAspect="1"/>
             </wp:cNvGraphicFramePr>
@@ -12761,7 +13940,7 @@
           <wp:inline distT="0" distB="0" distL="0" distR="0">
             <wp:extent cx="5486400" cy="3064668"/>
             <wp:effectExtent l="0" t="0" r="0" b="0"/>
-            <wp:docPr id="9676076" name="Tournament Matches"/>
+            <wp:docPr id="80404112" name="Tournament Matches"/>
             <wp:cNvGraphicFramePr>
               <a:graphicFrameLocks xmlns:a="http://schemas.openxmlformats.org/drawingml/2006/main" noChangeAspect="1"/>
             </wp:cNvGraphicFramePr>
@@ -12870,7 +14049,7 @@
           <wp:inline distT="0" distB="0" distL="0" distR="0">
             <wp:extent cx="5486400" cy="3118246"/>
             <wp:effectExtent l="0" t="0" r="0" b="0"/>
-            <wp:docPr id="32119401" name="Match Scorecards"/>
+            <wp:docPr id="86034403" name="Match Scorecards"/>
             <wp:cNvGraphicFramePr>
               <a:graphicFrameLocks xmlns:a="http://schemas.openxmlformats.org/drawingml/2006/main" noChangeAspect="1"/>
             </wp:cNvGraphicFramePr>
@@ -12979,7 +14158,7 @@
           <wp:inline distT="0" distB="0" distL="0" distR="0">
             <wp:extent cx="5486400" cy="3091457"/>
             <wp:effectExtent l="0" t="0" r="0" b="0"/>
-            <wp:docPr id="99781944" name="Stadiums View"/>
+            <wp:docPr id="98053009" name="Stadiums View"/>
             <wp:cNvGraphicFramePr>
               <a:graphicFrameLocks xmlns:a="http://schemas.openxmlformats.org/drawingml/2006/main" noChangeAspect="1"/>
             </wp:cNvGraphicFramePr>
@@ -13088,7 +14267,7 @@
           <wp:inline distT="0" distB="0" distL="0" distR="0">
             <wp:extent cx="5486400" cy="3086100"/>
             <wp:effectExtent l="0" t="0" r="0" b="0"/>
-            <wp:docPr id="33130059" name="Tournament Analytics"/>
+            <wp:docPr id="35711565" name="Tournament Analytics"/>
             <wp:cNvGraphicFramePr>
               <a:graphicFrameLocks xmlns:a="http://schemas.openxmlformats.org/drawingml/2006/main" noChangeAspect="1"/>
             </wp:cNvGraphicFramePr>
@@ -13197,7 +14376,7 @@
           <wp:inline distT="0" distB="0" distL="0" distR="0">
             <wp:extent cx="5486400" cy="3123604"/>
             <wp:effectExtent l="0" t="0" r="0" b="0"/>
-            <wp:docPr id="36203514" name="Sponsorships"/>
+            <wp:docPr id="17029521" name="Sponsorships"/>
             <wp:cNvGraphicFramePr>
               <a:graphicFrameLocks xmlns:a="http://schemas.openxmlformats.org/drawingml/2006/main" noChangeAspect="1"/>
             </wp:cNvGraphicFramePr>
@@ -13306,7 +14485,7 @@
           <wp:inline distT="0" distB="0" distL="0" distR="0">
             <wp:extent cx="5486400" cy="3059310"/>
             <wp:effectExtent l="0" t="0" r="0" b="0"/>
-            <wp:docPr id="81334988" name="Umpires"/>
+            <wp:docPr id="61469581" name="Umpires"/>
             <wp:cNvGraphicFramePr>
               <a:graphicFrameLocks xmlns:a="http://schemas.openxmlformats.org/drawingml/2006/main" noChangeAspect="1"/>
             </wp:cNvGraphicFramePr>
@@ -13415,7 +14594,7 @@
           <wp:inline distT="0" distB="0" distL="0" distR="0">
             <wp:extent cx="5486400" cy="3086100"/>
             <wp:effectExtent l="0" t="0" r="0" b="0"/>
-            <wp:docPr id="40670832" name="Authentication Modal"/>
+            <wp:docPr id="406528" name="Authentication Modal"/>
             <wp:cNvGraphicFramePr>
               <a:graphicFrameLocks xmlns:a="http://schemas.openxmlformats.org/drawingml/2006/main" noChangeAspect="1"/>
             </wp:cNvGraphicFramePr>
@@ -13524,7 +14703,7 @@
           <wp:inline distT="0" distB="0" distL="0" distR="0">
             <wp:extent cx="5486400" cy="3091457"/>
             <wp:effectExtent l="0" t="0" r="0" b="0"/>
-            <wp:docPr id="34229493" name="Global Search Dropdown"/>
+            <wp:docPr id="58616344" name="Global Search Dropdown"/>
             <wp:cNvGraphicFramePr>
               <a:graphicFrameLocks xmlns:a="http://schemas.openxmlformats.org/drawingml/2006/main" noChangeAspect="1"/>
             </wp:cNvGraphicFramePr>

</xml_diff>

<commit_message>
docs: add IEEE in-text citations [1]-[8] throughout project report
</commit_message>
<xml_diff>
--- a/CricketBuddy_Project_Report.docx
+++ b/CricketBuddy_Project_Report.docx
@@ -3756,7 +3756,7 @@
           <w:rFonts w:ascii="Times New Roman" w:hAnsi="Times New Roman" w:cs="Times New Roman"/>
           <w:color w:val="1E293B"/>
         </w:rPr>
-        <w:t xml:space="preserve">Cricket is celebrated as one of the most widely followed professional sports globally, engaging hundreds of franchises, thousands of athletic players, multimillion-dollar corporate sponsorships, and millions of passionate spectators. Organizing modern cricket tournaments—whether multi-tier domestic championships, premier leagues, or collegiate tournaments—demands the systematic coordination of interlinked operational data, including participating teams, player rosters, certified umpires, venues, match schedules, live scorecards, and sponsorship contracts.</w:t>
+        <w:t xml:space="preserve">Cricket is celebrated as one of the most widely followed professional sports globally, engaging hundreds of franchises, thousands of athletic players, multimillion-dollar corporate sponsorships, and millions of passionate spectators. Organizing modern cricket tournaments—whether multi-tier domestic championships, premier leagues, or collegiate tournaments—demands the systematic coordination of interlinked operational data, including participating teams, player rosters, certified umpires, venues, match schedules, live scorecards, and commercial sponsorship contracts governed under regulations modeled on the International Cricket Council (ICC) standards [1].</w:t>
       </w:r>
     </w:p>
     <w:p>
@@ -3790,7 +3790,7 @@
           <w:rFonts w:ascii="Times New Roman" w:hAnsi="Times New Roman" w:cs="Times New Roman"/>
           <w:color w:val="1E293B"/>
         </w:rPr>
-        <w:t xml:space="preserve">To eliminate these challenges, the Cricket Tournament Management System (CricketBuddy) was conceived as a centralized, relational database-driven web platform. Developed using MySQL 9.7 as the primary RDBMS, an Express.js / Node.js backend server, and a high-performance interactive frontend interface, CricketBuddy provides automated record management, referential integrity, and transparent data exploration for both administrators and viewers.</w:t>
+        <w:t xml:space="preserve">To eliminate these challenges, the Cricket Tournament Management System (CricketBuddy) was conceived as a centralized, relational database-driven web platform following robust database design principles [2]. Developed using MySQL 9.7 as the primary RDBMS, an Express.js / Node.js backend server, and a high-performance interactive frontend interface, CricketBuddy provides automated record management, referential integrity, and transparent data exploration for both administrators and viewers.</w:t>
       </w:r>
     </w:p>
     <w:p>
@@ -3917,7 +3917,7 @@
           <w:rFonts w:ascii="Times New Roman" w:hAnsi="Times New Roman" w:cs="Times New Roman"/>
           <w:color w:val="1E293B"/>
         </w:rPr>
-        <w:t xml:space="preserve">• To architect an authentic relational database schema normalized to BCNF under CricketTournamentDB, capturing 9 interrelated entities without data anomalies.</w:t>
+        <w:t xml:space="preserve">• To architect an authentic relational database schema normalized to BCNF under CricketTournamentDB, capturing 9 interrelated entities without data anomalies [2], [3].</w:t>
       </w:r>
     </w:p>
     <w:p>
@@ -3935,7 +3935,7 @@
           <w:rFonts w:ascii="Times New Roman" w:hAnsi="Times New Roman" w:cs="Times New Roman"/>
           <w:color w:val="1E293B"/>
         </w:rPr>
-        <w:t xml:space="preserve">• To design an expressive Chen-notation Entity-Relationship (ER) model identifying cardinality ratios (1:N, M:N) and primary/foreign key mappings.</w:t>
+        <w:t xml:space="preserve">• To design an expressive Chen-notation Entity-Relationship (ER) model identifying cardinality ratios (1:N, M:N) and primary/foreign key mappings [3].</w:t>
       </w:r>
     </w:p>
     <w:p>
@@ -4279,7 +4279,7 @@
           <w:rFonts w:ascii="Times New Roman" w:hAnsi="Times New Roman" w:cs="Times New Roman"/>
           <w:color w:val="1E293B"/>
         </w:rPr>
-        <w:t xml:space="preserve">MySQL is an industry-leading open-source RDBMS renowned for ACID compliance (Atomicity, Consistency, Isolation, Durability), reliable InnoDB storage engine, multi-version concurrency control (MVCC), and structured query optimization. In CricketBuddy, MySQL 9.7 manages the 9 core relations, indexing primary and foreign keys for instantaneous join lookups.</w:t>
+        <w:t xml:space="preserve">MySQL is an industry-leading open-source RDBMS renowned for ACID compliance (Atomicity, Consistency, Isolation, Durability), reliable InnoDB storage engine, multi-version concurrency control (MVCC), and structured query optimization [4]. In CricketBuddy, MySQL 9.7 manages the 9 core relations, indexing primary and foreign keys for instantaneous join lookups [4].</w:t>
       </w:r>
     </w:p>
     <w:p>
@@ -4321,7 +4321,7 @@
           <w:rFonts w:ascii="Times New Roman" w:hAnsi="Times New Roman" w:cs="Times New Roman"/>
           <w:color w:val="1E293B"/>
         </w:rPr>
-        <w:t xml:space="preserve">Node.js provides an asynchronous, event-driven JavaScript runtime ideal for I/O-intensive database operations. Express.js acts as the server framework, exposing REST endpoints (/api/teams, /api/players, /api/stadiums, /api/matches, /api/scorecards, /api/sponsors, /api/umpires, /api/statistics). It utilizes the mysql2 connection pool with parameterized queries to prevent SQL injection.</w:t>
+        <w:t xml:space="preserve">Node.js provides an asynchronous, event-driven JavaScript runtime ideal for I/O-intensive database operations [5]. Express.js acts as the server framework [6], exposing REST endpoints (/api/teams, /api/players, /api/stadiums, /api/matches, /api/scorecards, /api/sponsors, /api/umpires, /api/statistics). Client-server communication strictly follows stateless RESTful architectural constraints and standard HTTP verbs (GET, POST, PUT, DELETE) with structured JSON payloads [7]. The service layer utilizes the mysql2 connection pool with parameterized queries to prevent SQL injection.</w:t>
       </w:r>
     </w:p>
     <w:p>
@@ -4363,7 +4363,7 @@
           <w:rFonts w:ascii="Times New Roman" w:hAnsi="Times New Roman" w:cs="Times New Roman"/>
           <w:color w:val="1E293B"/>
         </w:rPr>
-        <w:t xml:space="preserve">The presentation tier is engineered using vanilla ES6+ JavaScript, semantic HTML5, modern CSS3 with custom variables, and offline-bundled Lucide SVG icons. This ensures sub-50ms DOM rendering, zero build-step overhead, and smooth responsiveness across desktop and mobile devices.</w:t>
+        <w:t xml:space="preserve">The presentation tier is engineered using vanilla ES6+ JavaScript, semantic HTML5, modern CSS3 specifications [8] with custom variables, and offline-bundled Lucide SVG icons. This ensures sub-50ms DOM rendering, zero build-step overhead, and smooth responsiveness across desktop and mobile devices.</w:t>
       </w:r>
     </w:p>
     <w:p>
@@ -4474,7 +4474,7 @@
           <w:rFonts w:ascii="Times New Roman" w:hAnsi="Times New Roman" w:cs="Times New Roman"/>
           <w:color w:val="1E293B"/>
         </w:rPr>
-        <w:t xml:space="preserve">The design of CricketTournamentDB follows standard relational database lifecycle principles: conceptual entity identification, cardinality mapping, relational schema decomposition, and BCNF verification. The system represents 9 entities linked via 1-to-many and many-to-many relationships.</w:t>
+        <w:t xml:space="preserve">The design of CricketTournamentDB follows standard relational database lifecycle principles as articulated by Silberschatz et al. [2]: conceptual entity identification, cardinality mapping, relational schema decomposition, and BCNF verification. The system represents 9 entities linked via 1-to-many and many-to-many relationships.</w:t>
       </w:r>
     </w:p>
     <w:p>
@@ -4515,7 +4515,7 @@
           <w:rFonts w:ascii="Times New Roman" w:hAnsi="Times New Roman" w:cs="Times New Roman"/>
           <w:color w:val="1E293B"/>
         </w:rPr>
-        <w:t xml:space="preserve">Figure 3.1 depicts the formal Entity-Relationship diagram in Chen's notation. Entities are shown as rectangles, attributes as ovals (primary keys underlined), relationships as diamonds, and associative tables as double diamonds.</w:t>
+        <w:t xml:space="preserve">Figure 3.1 depicts the formal Entity-Relationship diagram in Chen's notation, adhering to standard ER modeling conventions described by Elmasri and Navathe [3]. Entities are shown as rectangles, attributes as ovals (primary keys underlined), relationships as diamonds, and associative tables as double diamonds.</w:t>
       </w:r>
     </w:p>
     <w:p>
@@ -4528,7 +4528,7 @@
           <wp:inline distT="0" distB="0" distL="0" distR="0">
             <wp:extent cx="5486400" cy="3550000"/>
             <wp:effectExtent l="0" t="0" r="0" b="0"/>
-            <wp:docPr id="55728212" name="ER Diagram"/>
+            <wp:docPr id="12005741" name="ER Diagram"/>
             <wp:cNvGraphicFramePr>
               <a:graphicFrameLocks xmlns:a="http://schemas.openxmlformats.org/drawingml/2006/main" noChangeAspect="1"/>
             </wp:cNvGraphicFramePr>
@@ -11887,7 +11887,7 @@
           <w:rFonts w:ascii="Times New Roman" w:hAnsi="Times New Roman" w:cs="Times New Roman"/>
           <w:color w:val="1E293B"/>
         </w:rPr>
-        <w:t xml:space="preserve">Database normalization is the formal mathematical technique of organizing relations to minimize redundancy and eliminate insert, update, and delete anomalies. The schema CricketTournamentDB satisfies Boyce-Codd Normal Form (BCNF):</w:t>
+        <w:t xml:space="preserve">Database normalization is the formal mathematical technique of organizing relations to minimize redundancy and eliminate insert, update, and delete anomalies [2]. The schema CricketTournamentDB satisfies Boyce-Codd Normal Form (BCNF):</w:t>
       </w:r>
     </w:p>
     <w:p>
@@ -12106,7 +12106,7 @@
           <w:rFonts w:ascii="Times New Roman" w:hAnsi="Times New Roman" w:cs="Times New Roman"/>
           <w:color w:val="1E293B"/>
         </w:rPr>
-        <w:t xml:space="preserve">Requirement: For every non-trivial functional dependency X -&gt; Y, X must be a superkey.</w:t>
+        <w:t xml:space="preserve">Requirement: As formalized by Elmasri and Navathe [3], for every non-trivial functional dependency X -&gt; Y, X must be a superkey.</w:t>
       </w:r>
     </w:p>
     <w:p>
@@ -12241,7 +12241,7 @@
           <w:rFonts w:ascii="Times New Roman" w:hAnsi="Times New Roman" w:cs="Times New Roman"/>
           <w:color w:val="1E293B"/>
         </w:rPr>
-        <w:t xml:space="preserve">To resolve multi-table JOIN overhead while strictly preserving Boyce-Codd Normal Form (BCNF) in the foundational tables, seven relational database Views were designed and deployed directly in MySQL under CricketTournamentDB. In relational database theory, a VIEW acts as a pre-compiled virtual relation dynamically produced by the database query optimizer. This provides major system benefits:</w:t>
+        <w:t xml:space="preserve">To resolve multi-table JOIN overhead while strictly preserving Boyce-Codd Normal Form (BCNF) in the foundational tables, seven relational database Views were designed and deployed directly in MySQL under CricketTournamentDB using the MySQL 9.7 database engine [4]. In relational database theory [2], a VIEW acts as a pre-compiled virtual relation dynamically produced by the database query optimizer. This provides major system benefits:</w:t>
       </w:r>
     </w:p>
     <w:p>
@@ -13382,7 +13382,7 @@
           <w:rFonts w:ascii="Times New Roman" w:hAnsi="Times New Roman" w:cs="Times New Roman"/>
           <w:color w:val="1E293B"/>
         </w:rPr>
-        <w:t xml:space="preserve">CricketBuddy is built on a decoupled 3-tier client-server architecture: a MySQL 9.7 relational database tier, an asynchronous Node.js / Express.js REST API tier, and a responsive HTML5, CSS3, ES6 JavaScript presentation tier with offline Lucide icons.</w:t>
+        <w:t xml:space="preserve">CricketBuddy is built on a decoupled 3-tier client-server architecture: a MySQL 9.7 relational database tier [4], an asynchronous Node.js [5] / Express.js [6] REST API tier [7], and a responsive HTML5, CSS3 [8], ES6 JavaScript presentation tier with offline Lucide icons.</w:t>
       </w:r>
     </w:p>
     <w:p>
@@ -13423,7 +13423,7 @@
           <w:rFonts w:ascii="Times New Roman" w:hAnsi="Times New Roman" w:cs="Times New Roman"/>
           <w:color w:val="1E293B"/>
         </w:rPr>
-        <w:t xml:space="preserve">The database was created under catalog CricketTournamentDB. Verification via the interactive MySQL CLI confirmed that all nine tables and schema attributes were created successfully:</w:t>
+        <w:t xml:space="preserve">The foundational database layer was implemented and verified directly within the MySQL 9.7 RDBMS engine [4]. The database catalog CricketTournamentDB was instantiated with all foreign key constraints, primary key indices, and automated cascading behaviors enabled. Verification via the interactive MySQL CLI confirmed that all tables, views, and schema attributes were created successfully:</w:t>
       </w:r>
     </w:p>
     <w:p>
@@ -13436,7 +13436,7 @@
           <wp:inline distT="0" distB="0" distL="0" distR="0">
             <wp:extent cx="5486400" cy="3321620"/>
             <wp:effectExtent l="0" t="0" r="0" b="0"/>
-            <wp:docPr id="66733885" name="MySQL Tables"/>
+            <wp:docPr id="6285616" name="MySQL Tables"/>
             <wp:cNvGraphicFramePr>
               <a:graphicFrameLocks xmlns:a="http://schemas.openxmlformats.org/drawingml/2006/main" noChangeAspect="1"/>
             </wp:cNvGraphicFramePr>
@@ -13504,7 +13504,7 @@
           <wp:inline distT="0" distB="0" distL="0" distR="0">
             <wp:extent cx="5486400" cy="3868340"/>
             <wp:effectExtent l="0" t="0" r="0" b="0"/>
-            <wp:docPr id="55038939" name="MySQL Describe"/>
+            <wp:docPr id="64501551" name="MySQL Describe"/>
             <wp:cNvGraphicFramePr>
               <a:graphicFrameLocks xmlns:a="http://schemas.openxmlformats.org/drawingml/2006/main" noChangeAspect="1"/>
             </wp:cNvGraphicFramePr>
@@ -13613,7 +13613,7 @@
           <wp:inline distT="0" distB="0" distL="0" distR="0">
             <wp:extent cx="5486400" cy="3118246"/>
             <wp:effectExtent l="0" t="0" r="0" b="0"/>
-            <wp:docPr id="13613712" name="Dashboard"/>
+            <wp:docPr id="64790334" name="Dashboard"/>
             <wp:cNvGraphicFramePr>
               <a:graphicFrameLocks xmlns:a="http://schemas.openxmlformats.org/drawingml/2006/main" noChangeAspect="1"/>
             </wp:cNvGraphicFramePr>
@@ -13722,7 +13722,7 @@
           <wp:inline distT="0" distB="0" distL="0" distR="0">
             <wp:extent cx="5486400" cy="3080742"/>
             <wp:effectExtent l="0" t="0" r="0" b="0"/>
-            <wp:docPr id="81990788" name="Teams Roster"/>
+            <wp:docPr id="36611905" name="Teams Roster"/>
             <wp:cNvGraphicFramePr>
               <a:graphicFrameLocks xmlns:a="http://schemas.openxmlformats.org/drawingml/2006/main" noChangeAspect="1"/>
             </wp:cNvGraphicFramePr>
@@ -13831,7 +13831,7 @@
           <wp:inline distT="0" distB="0" distL="0" distR="0">
             <wp:extent cx="5486400" cy="3107531"/>
             <wp:effectExtent l="0" t="0" r="0" b="0"/>
-            <wp:docPr id="4664392" name="Players Roster"/>
+            <wp:docPr id="70282009" name="Players Roster"/>
             <wp:cNvGraphicFramePr>
               <a:graphicFrameLocks xmlns:a="http://schemas.openxmlformats.org/drawingml/2006/main" noChangeAspect="1"/>
             </wp:cNvGraphicFramePr>
@@ -13940,7 +13940,7 @@
           <wp:inline distT="0" distB="0" distL="0" distR="0">
             <wp:extent cx="5486400" cy="3064668"/>
             <wp:effectExtent l="0" t="0" r="0" b="0"/>
-            <wp:docPr id="80404112" name="Tournament Matches"/>
+            <wp:docPr id="68768907" name="Tournament Matches"/>
             <wp:cNvGraphicFramePr>
               <a:graphicFrameLocks xmlns:a="http://schemas.openxmlformats.org/drawingml/2006/main" noChangeAspect="1"/>
             </wp:cNvGraphicFramePr>
@@ -14049,7 +14049,7 @@
           <wp:inline distT="0" distB="0" distL="0" distR="0">
             <wp:extent cx="5486400" cy="3118246"/>
             <wp:effectExtent l="0" t="0" r="0" b="0"/>
-            <wp:docPr id="86034403" name="Match Scorecards"/>
+            <wp:docPr id="15977839" name="Match Scorecards"/>
             <wp:cNvGraphicFramePr>
               <a:graphicFrameLocks xmlns:a="http://schemas.openxmlformats.org/drawingml/2006/main" noChangeAspect="1"/>
             </wp:cNvGraphicFramePr>
@@ -14158,7 +14158,7 @@
           <wp:inline distT="0" distB="0" distL="0" distR="0">
             <wp:extent cx="5486400" cy="3091457"/>
             <wp:effectExtent l="0" t="0" r="0" b="0"/>
-            <wp:docPr id="98053009" name="Stadiums View"/>
+            <wp:docPr id="81023279" name="Stadiums View"/>
             <wp:cNvGraphicFramePr>
               <a:graphicFrameLocks xmlns:a="http://schemas.openxmlformats.org/drawingml/2006/main" noChangeAspect="1"/>
             </wp:cNvGraphicFramePr>
@@ -14267,7 +14267,7 @@
           <wp:inline distT="0" distB="0" distL="0" distR="0">
             <wp:extent cx="5486400" cy="3086100"/>
             <wp:effectExtent l="0" t="0" r="0" b="0"/>
-            <wp:docPr id="35711565" name="Tournament Analytics"/>
+            <wp:docPr id="6384139" name="Tournament Analytics"/>
             <wp:cNvGraphicFramePr>
               <a:graphicFrameLocks xmlns:a="http://schemas.openxmlformats.org/drawingml/2006/main" noChangeAspect="1"/>
             </wp:cNvGraphicFramePr>
@@ -14376,7 +14376,7 @@
           <wp:inline distT="0" distB="0" distL="0" distR="0">
             <wp:extent cx="5486400" cy="3123604"/>
             <wp:effectExtent l="0" t="0" r="0" b="0"/>
-            <wp:docPr id="17029521" name="Sponsorships"/>
+            <wp:docPr id="958211" name="Sponsorships"/>
             <wp:cNvGraphicFramePr>
               <a:graphicFrameLocks xmlns:a="http://schemas.openxmlformats.org/drawingml/2006/main" noChangeAspect="1"/>
             </wp:cNvGraphicFramePr>
@@ -14485,7 +14485,7 @@
           <wp:inline distT="0" distB="0" distL="0" distR="0">
             <wp:extent cx="5486400" cy="3059310"/>
             <wp:effectExtent l="0" t="0" r="0" b="0"/>
-            <wp:docPr id="61469581" name="Umpires"/>
+            <wp:docPr id="4090451" name="Umpires"/>
             <wp:cNvGraphicFramePr>
               <a:graphicFrameLocks xmlns:a="http://schemas.openxmlformats.org/drawingml/2006/main" noChangeAspect="1"/>
             </wp:cNvGraphicFramePr>
@@ -14594,7 +14594,7 @@
           <wp:inline distT="0" distB="0" distL="0" distR="0">
             <wp:extent cx="5486400" cy="3086100"/>
             <wp:effectExtent l="0" t="0" r="0" b="0"/>
-            <wp:docPr id="406528" name="Authentication Modal"/>
+            <wp:docPr id="79772768" name="Authentication Modal"/>
             <wp:cNvGraphicFramePr>
               <a:graphicFrameLocks xmlns:a="http://schemas.openxmlformats.org/drawingml/2006/main" noChangeAspect="1"/>
             </wp:cNvGraphicFramePr>
@@ -14703,7 +14703,7 @@
           <wp:inline distT="0" distB="0" distL="0" distR="0">
             <wp:extent cx="5486400" cy="3091457"/>
             <wp:effectExtent l="0" t="0" r="0" b="0"/>
-            <wp:docPr id="58616344" name="Global Search Dropdown"/>
+            <wp:docPr id="49350054" name="Global Search Dropdown"/>
             <wp:cNvGraphicFramePr>
               <a:graphicFrameLocks xmlns:a="http://schemas.openxmlformats.org/drawingml/2006/main" noChangeAspect="1"/>
             </wp:cNvGraphicFramePr>
@@ -15496,7 +15496,7 @@
           <w:rFonts w:ascii="Times New Roman" w:hAnsi="Times New Roman" w:cs="Times New Roman"/>
           <w:color w:val="1E293B"/>
         </w:rPr>
-        <w:t xml:space="preserve">Future research could investigate database sharding and read-replica distribution strategies to handle massive spikes during tournament finals. Additionally, machine learning algorithms could be trained on historical MatchScorecard records to generate predictive match-outcome models, Duckworth-Lewis-Stern (DLS) calculations, and automated athletic injury risk assessments.</w:t>
+        <w:t xml:space="preserve">Future research could investigate database sharding and read-replica distribution strategies to handle massive spikes during tournament finals. Additionally, machine learning algorithms could be trained on historical MatchScorecard records to generate predictive match-outcome models, Duckworth-Lewis-Stern (DLS) calculations conforming to ICC tournament regulations [1], and automated athletic injury risk assessments.</w:t>
       </w:r>
     </w:p>
     <w:p>
@@ -15546,7 +15546,7 @@
           <w:szCs w:val="20"/>
           <w:color w:val="334155"/>
         </w:rPr>
-        <w:t xml:space="preserve">[1] Oracle Corporation. (2026). MySQL 9.7 Reference Manual. Available at: https://dev.mysql.com/doc/refman/9.7/en/</w:t>
+        <w:t xml:space="preserve">[1] International Cricket Council (ICC). (2026). Standard Playing Conditions and Tournament Regulations. Available at: https://www.icc-cricket.com/</w:t>
       </w:r>
     </w:p>
     <w:p>
@@ -15609,7 +15609,7 @@
           <w:szCs w:val="20"/>
           <w:color w:val="334155"/>
         </w:rPr>
-        <w:t xml:space="preserve">[4] OpenJS Foundation. (2026). Node.js v20 Long-Term Support Documentation. Available at: https://nodejs.org/docs/</w:t>
+        <w:t xml:space="preserve">[4] Oracle Corporation. (2026). MySQL 9.7 Reference Manual. Available at: https://dev.mysql.com/doc/refman/9.7/en/</w:t>
       </w:r>
     </w:p>
     <w:p>
@@ -15630,7 +15630,7 @@
           <w:szCs w:val="20"/>
           <w:color w:val="334155"/>
         </w:rPr>
-        <w:t xml:space="preserve">[5] Express.js Foundation. (2026). Express Web Framework Documentation. Available at: https://expressjs.com/</w:t>
+        <w:t xml:space="preserve">[5] OpenJS Foundation. (2026). Node.js v20 Long-Term Support Documentation. Available at: https://nodejs.org/docs/</w:t>
       </w:r>
     </w:p>
     <w:p>
@@ -15651,7 +15651,7 @@
           <w:szCs w:val="20"/>
           <w:color w:val="334155"/>
         </w:rPr>
-        <w:t xml:space="preserve">[6] MDN Web Docs. (2026). HTTP Request Methods and REST API Architecture. Available at: https://developer.mozilla.org/en-US/docs/Web/HTTP/Methods</w:t>
+        <w:t xml:space="preserve">[6] Express.js Foundation. (2026). Express Web Framework Documentation. Available at: https://expressjs.com/</w:t>
       </w:r>
     </w:p>
     <w:p>
@@ -15672,7 +15672,7 @@
           <w:szCs w:val="20"/>
           <w:color w:val="334155"/>
         </w:rPr>
-        <w:t xml:space="preserve">[7] W3C. (2026). HTML5 and CSS3 Specifications. Available at: https://www.w3.org/TR/html5/</w:t>
+        <w:t xml:space="preserve">[7] MDN Web Docs. (2026). HTTP Request Methods and REST API Architecture. Available at: https://developer.mozilla.org/en-US/docs/Web/HTTP/Methods</w:t>
       </w:r>
     </w:p>
     <w:p>
@@ -15693,7 +15693,7 @@
           <w:szCs w:val="20"/>
           <w:color w:val="334155"/>
         </w:rPr>
-        <w:t xml:space="preserve">[8] International Cricket Council (ICC). (2026). Standard Playing Conditions and Tournament Regulations. Available at: https://www.icc-cricket.com/</w:t>
+        <w:t xml:space="preserve">[8] W3C. (2026). HTML5 and CSS3 Specifications. Available at: https://www.w3.org/TR/html5/</w:t>
       </w:r>
     </w:p>
     <w:sectPr>

</xml_diff>

<commit_message>
docs: optimize report file size below 2MB and refresh PDF with all IEEE citations and views
</commit_message>
<xml_diff>
--- a/CricketBuddy_Project_Report.docx
+++ b/CricketBuddy_Project_Report.docx
@@ -4528,7 +4528,7 @@
           <wp:inline distT="0" distB="0" distL="0" distR="0">
             <wp:extent cx="5486400" cy="3550000"/>
             <wp:effectExtent l="0" t="0" r="0" b="0"/>
-            <wp:docPr id="12005741" name="ER Diagram"/>
+            <wp:docPr id="72401345" name="ER Diagram"/>
             <wp:cNvGraphicFramePr>
               <a:graphicFrameLocks xmlns:a="http://schemas.openxmlformats.org/drawingml/2006/main" noChangeAspect="1"/>
             </wp:cNvGraphicFramePr>
@@ -13436,7 +13436,7 @@
           <wp:inline distT="0" distB="0" distL="0" distR="0">
             <wp:extent cx="5486400" cy="3321620"/>
             <wp:effectExtent l="0" t="0" r="0" b="0"/>
-            <wp:docPr id="6285616" name="MySQL Tables"/>
+            <wp:docPr id="6834886" name="MySQL Tables"/>
             <wp:cNvGraphicFramePr>
               <a:graphicFrameLocks xmlns:a="http://schemas.openxmlformats.org/drawingml/2006/main" noChangeAspect="1"/>
             </wp:cNvGraphicFramePr>
@@ -13504,7 +13504,7 @@
           <wp:inline distT="0" distB="0" distL="0" distR="0">
             <wp:extent cx="5486400" cy="3868340"/>
             <wp:effectExtent l="0" t="0" r="0" b="0"/>
-            <wp:docPr id="64501551" name="MySQL Describe"/>
+            <wp:docPr id="53309889" name="MySQL Describe"/>
             <wp:cNvGraphicFramePr>
               <a:graphicFrameLocks xmlns:a="http://schemas.openxmlformats.org/drawingml/2006/main" noChangeAspect="1"/>
             </wp:cNvGraphicFramePr>
@@ -13613,7 +13613,7 @@
           <wp:inline distT="0" distB="0" distL="0" distR="0">
             <wp:extent cx="5486400" cy="3118246"/>
             <wp:effectExtent l="0" t="0" r="0" b="0"/>
-            <wp:docPr id="64790334" name="Dashboard"/>
+            <wp:docPr id="37268544" name="Dashboard"/>
             <wp:cNvGraphicFramePr>
               <a:graphicFrameLocks xmlns:a="http://schemas.openxmlformats.org/drawingml/2006/main" noChangeAspect="1"/>
             </wp:cNvGraphicFramePr>
@@ -13722,7 +13722,7 @@
           <wp:inline distT="0" distB="0" distL="0" distR="0">
             <wp:extent cx="5486400" cy="3080742"/>
             <wp:effectExtent l="0" t="0" r="0" b="0"/>
-            <wp:docPr id="36611905" name="Teams Roster"/>
+            <wp:docPr id="1224622" name="Teams Roster"/>
             <wp:cNvGraphicFramePr>
               <a:graphicFrameLocks xmlns:a="http://schemas.openxmlformats.org/drawingml/2006/main" noChangeAspect="1"/>
             </wp:cNvGraphicFramePr>
@@ -13831,7 +13831,7 @@
           <wp:inline distT="0" distB="0" distL="0" distR="0">
             <wp:extent cx="5486400" cy="3107531"/>
             <wp:effectExtent l="0" t="0" r="0" b="0"/>
-            <wp:docPr id="70282009" name="Players Roster"/>
+            <wp:docPr id="76671511" name="Players Roster"/>
             <wp:cNvGraphicFramePr>
               <a:graphicFrameLocks xmlns:a="http://schemas.openxmlformats.org/drawingml/2006/main" noChangeAspect="1"/>
             </wp:cNvGraphicFramePr>
@@ -13940,7 +13940,7 @@
           <wp:inline distT="0" distB="0" distL="0" distR="0">
             <wp:extent cx="5486400" cy="3064668"/>
             <wp:effectExtent l="0" t="0" r="0" b="0"/>
-            <wp:docPr id="68768907" name="Tournament Matches"/>
+            <wp:docPr id="42295983" name="Tournament Matches"/>
             <wp:cNvGraphicFramePr>
               <a:graphicFrameLocks xmlns:a="http://schemas.openxmlformats.org/drawingml/2006/main" noChangeAspect="1"/>
             </wp:cNvGraphicFramePr>
@@ -14049,7 +14049,7 @@
           <wp:inline distT="0" distB="0" distL="0" distR="0">
             <wp:extent cx="5486400" cy="3118246"/>
             <wp:effectExtent l="0" t="0" r="0" b="0"/>
-            <wp:docPr id="15977839" name="Match Scorecards"/>
+            <wp:docPr id="87252740" name="Match Scorecards"/>
             <wp:cNvGraphicFramePr>
               <a:graphicFrameLocks xmlns:a="http://schemas.openxmlformats.org/drawingml/2006/main" noChangeAspect="1"/>
             </wp:cNvGraphicFramePr>
@@ -14158,7 +14158,7 @@
           <wp:inline distT="0" distB="0" distL="0" distR="0">
             <wp:extent cx="5486400" cy="3091457"/>
             <wp:effectExtent l="0" t="0" r="0" b="0"/>
-            <wp:docPr id="81023279" name="Stadiums View"/>
+            <wp:docPr id="47459737" name="Stadiums View"/>
             <wp:cNvGraphicFramePr>
               <a:graphicFrameLocks xmlns:a="http://schemas.openxmlformats.org/drawingml/2006/main" noChangeAspect="1"/>
             </wp:cNvGraphicFramePr>
@@ -14267,7 +14267,7 @@
           <wp:inline distT="0" distB="0" distL="0" distR="0">
             <wp:extent cx="5486400" cy="3086100"/>
             <wp:effectExtent l="0" t="0" r="0" b="0"/>
-            <wp:docPr id="6384139" name="Tournament Analytics"/>
+            <wp:docPr id="26973979" name="Tournament Analytics"/>
             <wp:cNvGraphicFramePr>
               <a:graphicFrameLocks xmlns:a="http://schemas.openxmlformats.org/drawingml/2006/main" noChangeAspect="1"/>
             </wp:cNvGraphicFramePr>
@@ -14376,7 +14376,7 @@
           <wp:inline distT="0" distB="0" distL="0" distR="0">
             <wp:extent cx="5486400" cy="3123604"/>
             <wp:effectExtent l="0" t="0" r="0" b="0"/>
-            <wp:docPr id="958211" name="Sponsorships"/>
+            <wp:docPr id="59271402" name="Sponsorships"/>
             <wp:cNvGraphicFramePr>
               <a:graphicFrameLocks xmlns:a="http://schemas.openxmlformats.org/drawingml/2006/main" noChangeAspect="1"/>
             </wp:cNvGraphicFramePr>
@@ -14485,7 +14485,7 @@
           <wp:inline distT="0" distB="0" distL="0" distR="0">
             <wp:extent cx="5486400" cy="3059310"/>
             <wp:effectExtent l="0" t="0" r="0" b="0"/>
-            <wp:docPr id="4090451" name="Umpires"/>
+            <wp:docPr id="54793325" name="Umpires"/>
             <wp:cNvGraphicFramePr>
               <a:graphicFrameLocks xmlns:a="http://schemas.openxmlformats.org/drawingml/2006/main" noChangeAspect="1"/>
             </wp:cNvGraphicFramePr>
@@ -14594,7 +14594,7 @@
           <wp:inline distT="0" distB="0" distL="0" distR="0">
             <wp:extent cx="5486400" cy="3086100"/>
             <wp:effectExtent l="0" t="0" r="0" b="0"/>
-            <wp:docPr id="79772768" name="Authentication Modal"/>
+            <wp:docPr id="93896182" name="Authentication Modal"/>
             <wp:cNvGraphicFramePr>
               <a:graphicFrameLocks xmlns:a="http://schemas.openxmlformats.org/drawingml/2006/main" noChangeAspect="1"/>
             </wp:cNvGraphicFramePr>
@@ -14703,7 +14703,7 @@
           <wp:inline distT="0" distB="0" distL="0" distR="0">
             <wp:extent cx="5486400" cy="3091457"/>
             <wp:effectExtent l="0" t="0" r="0" b="0"/>
-            <wp:docPr id="49350054" name="Global Search Dropdown"/>
+            <wp:docPr id="81388339" name="Global Search Dropdown"/>
             <wp:cNvGraphicFramePr>
               <a:graphicFrameLocks xmlns:a="http://schemas.openxmlformats.org/drawingml/2006/main" noChangeAspect="1"/>
             </wp:cNvGraphicFramePr>

</xml_diff>